<commit_message>
docs: actualizar Guía 1 oficial con portada, índice, intereses profesionales, tabla de evidencias, plan de trabajo con facilitadores y carta gantt de 18 semanas; actualizar presentación y assets transparentes
</commit_message>
<xml_diff>
--- a/docs/Fase_1_Definicion_Proyecto_APT/Guia1_Definicion_Proyecto_APT_Fase1_Bruno_Urrea.docx
+++ b/docs/Fase_1_Definicion_Proyecto_APT/Guia1_Definicion_Proyecto_APT_Fase1_Bruno_Urrea.docx
@@ -3,16 +3,39 @@
 <w:document xmlns:wpc="http://schemas.microsoft.com/office/word/2010/wordprocessingCanvas" xmlns:mo="http://schemas.microsoft.com/office/mac/office/2008/main" xmlns:mc="http://schemas.openxmlformats.org/markup-compatibility/2006" xmlns:mv="urn:schemas-microsoft-com:mac:vml" xmlns:o="urn:schemas-microsoft-com:office:office" xmlns:r="http://schemas.openxmlformats.org/officeDocument/2006/relationships" xmlns:m="http://schemas.openxmlformats.org/officeDocument/2006/math" xmlns:v="urn:schemas-microsoft-com:vml" xmlns:wp14="http://schemas.microsoft.com/office/word/2010/wordprocessingDrawing" xmlns:wp="http://schemas.openxmlformats.org/drawingml/2006/wordprocessingDrawing" xmlns:w10="urn:schemas-microsoft-com:office:word" xmlns:w="http://schemas.openxmlformats.org/wordprocessingml/2006/main" xmlns:w14="http://schemas.microsoft.com/office/word/2010/wordml" xmlns:wpg="http://schemas.microsoft.com/office/word/2010/wordprocessingGroup" xmlns:wpi="http://schemas.microsoft.com/office/word/2010/wordprocessingInk" xmlns:wne="http://schemas.microsoft.com/office/word/2006/wordml" xmlns:wps="http://schemas.microsoft.com/office/word/2010/wordprocessingShape" mc:Ignorable="w14 wp14">
   <w:body>
     <w:p>
+      <w:pPr>
+        <w:jc w:val="center"/>
+      </w:pPr>
       <w:r>
         <w:rPr>
           <w:rFonts w:ascii="Arial" w:hAnsi="Arial"/>
           <w:b/>
-          <w:color w:val="333333"/>
-          <w:sz w:val="20"/>
+          <w:color w:val="003366"/>
+          <w:sz w:val="26"/>
         </w:rPr>
-        <w:t>Guía Estudiante - Definición Proyecto APT</w:t>
+        <w:t>DUOC UC</w:t>
         <w:br/>
-        <w:t>Fase 1</w:t>
+        <w:t>ESCUELA DE INFORMÁTICA Y TELECOMUNICACIONES</w:t>
+        <w:br/>
+      </w:r>
+      <w:r>
+        <w:rPr>
+          <w:rFonts w:ascii="Arial" w:hAnsi="Arial"/>
+          <w:b/>
+          <w:color w:val="555555"/>
+          <w:sz w:val="22"/>
+        </w:rPr>
+        <w:t>CARRERA DE INGENIERÍA EN CONECTIVIDAD Y REDES</w:t>
+        <w:br/>
+        <w:t>SEDE SAN JOAQUÍN</w:t>
+        <w:br/>
+      </w:r>
+    </w:p>
+    <w:p>
+      <w:r>
+        <w:br/>
+        <w:br/>
+        <w:br/>
       </w:r>
     </w:p>
     <w:p>
@@ -26,19 +49,160 @@
           <w:color w:val="003366"/>
           <w:sz w:val="32"/>
         </w:rPr>
-        <w:t>Guía1. Definición Proyecto APT</w:t>
+        <w:t>GUÍA 1: DEFINICIÓN PROYECTO APT</w:t>
         <w:br/>
-        <w:t>Asignatura Portafolio de Título (APT122)</w:t>
+        <w:t>ASIGNATURA CAPSTONE (APT122) — FASE 1</w:t>
+        <w:br/>
         <w:br/>
       </w:r>
       <w:r>
         <w:rPr>
           <w:rFonts w:ascii="Arial" w:hAnsi="Arial"/>
-          <w:i/>
+          <w:b/>
           <w:color w:val="006699"/>
-          <w:sz w:val="22"/>
+          <w:sz w:val="24"/>
         </w:rPr>
-        <w:t>KRONOS SENTINEL: Autonomous AI-IPS &amp; Real-Time Incident Voice Response SOAR Architecture</w:t>
+        <w:t>PROYECTO:</w:t>
+        <w:br/>
+        <w:t>KRONOS SENTINEL: AUTONOMOUS AI-IPS &amp; REAL-TIME INCIDENT VOICE RESPONSE SOAR ARCHITECTURE</w:t>
+      </w:r>
+    </w:p>
+    <w:p>
+      <w:r>
+        <w:br/>
+        <w:br/>
+        <w:br/>
+        <w:br/>
+      </w:r>
+    </w:p>
+    <w:p>
+      <w:pPr>
+        <w:jc w:val="right"/>
+      </w:pPr>
+      <w:r>
+        <w:rPr>
+          <w:rFonts w:ascii="Arial" w:hAnsi="Arial"/>
+          <w:b/>
+          <w:color w:val="222222"/>
+          <w:sz w:val="20"/>
+        </w:rPr>
+        <w:t xml:space="preserve">Estudiante Titulación: </w:t>
+      </w:r>
+      <w:r>
+        <w:rPr>
+          <w:rFonts w:ascii="Arial" w:hAnsi="Arial"/>
+          <w:b w:val="0"/>
+          <w:color w:val="222222"/>
+          <w:sz w:val="20"/>
+        </w:rPr>
+        <w:t>Bruno Urrea Ortiz</w:t>
+        <w:br/>
+      </w:r>
+      <w:r>
+        <w:rPr>
+          <w:rFonts w:ascii="Arial" w:hAnsi="Arial"/>
+          <w:b/>
+          <w:color w:val="222222"/>
+          <w:sz w:val="20"/>
+        </w:rPr>
+        <w:t xml:space="preserve">RUT: </w:t>
+      </w:r>
+      <w:r>
+        <w:rPr>
+          <w:rFonts w:ascii="Arial" w:hAnsi="Arial"/>
+          <w:b w:val="0"/>
+          <w:color w:val="222222"/>
+          <w:sz w:val="20"/>
+        </w:rPr>
+        <w:t>21.543.637-3</w:t>
+        <w:br/>
+      </w:r>
+      <w:r>
+        <w:rPr>
+          <w:rFonts w:ascii="Arial" w:hAnsi="Arial"/>
+          <w:b/>
+          <w:color w:val="222222"/>
+          <w:sz w:val="20"/>
+        </w:rPr>
+        <w:t xml:space="preserve">Equipo de Trabajo: </w:t>
+      </w:r>
+      <w:r>
+        <w:rPr>
+          <w:rFonts w:ascii="Arial" w:hAnsi="Arial"/>
+          <w:b w:val="0"/>
+          <w:color w:val="222222"/>
+          <w:sz w:val="20"/>
+        </w:rPr>
+        <w:t>Bruno Urrea Ortiz</w:t>
+        <w:br/>
+        <w:t>Freddy Vásquez Cortés</w:t>
+        <w:br/>
+        <w:t>Cristóbal Quezada</w:t>
+        <w:br/>
+        <w:t>Kevin Retamales</w:t>
+        <w:br/>
+      </w:r>
+      <w:r>
+        <w:rPr>
+          <w:rFonts w:ascii="Arial" w:hAnsi="Arial"/>
+          <w:b/>
+          <w:color w:val="222222"/>
+          <w:sz w:val="20"/>
+        </w:rPr>
+        <w:t xml:space="preserve">Asignatura: </w:t>
+      </w:r>
+      <w:r>
+        <w:rPr>
+          <w:rFonts w:ascii="Arial" w:hAnsi="Arial"/>
+          <w:b w:val="0"/>
+          <w:color w:val="222222"/>
+          <w:sz w:val="20"/>
+        </w:rPr>
+        <w:t>Portafolio de Título (APT122)</w:t>
+        <w:br/>
+      </w:r>
+      <w:r>
+        <w:rPr>
+          <w:rFonts w:ascii="Arial" w:hAnsi="Arial"/>
+          <w:b/>
+          <w:color w:val="222222"/>
+          <w:sz w:val="20"/>
+        </w:rPr>
+        <w:t xml:space="preserve">Docente Evaluador: </w:t>
+      </w:r>
+      <w:r>
+        <w:rPr>
+          <w:rFonts w:ascii="Arial" w:hAnsi="Arial"/>
+          <w:b w:val="0"/>
+          <w:color w:val="222222"/>
+          <w:sz w:val="20"/>
+        </w:rPr>
+        <w:t>Comisión Evaluadora APT122</w:t>
+        <w:br/>
+      </w:r>
+      <w:r>
+        <w:rPr>
+          <w:rFonts w:ascii="Arial" w:hAnsi="Arial"/>
+          <w:b/>
+          <w:color w:val="222222"/>
+          <w:sz w:val="20"/>
+        </w:rPr>
+        <w:t xml:space="preserve">Fecha: </w:t>
+      </w:r>
+      <w:r>
+        <w:rPr>
+          <w:rFonts w:ascii="Arial" w:hAnsi="Arial"/>
+          <w:b w:val="0"/>
+          <w:color w:val="222222"/>
+          <w:sz w:val="20"/>
+        </w:rPr>
+        <w:t>Septiembre 2026</w:t>
+        <w:br/>
+      </w:r>
+    </w:p>
+    <w:p>
+      <w:r>
+        <w:br w:type="page"/>
       </w:r>
     </w:p>
     <w:p>
@@ -46,8 +210,261 @@
         <w:rPr>
           <w:rFonts w:ascii="Arial" w:hAnsi="Arial"/>
           <w:b/>
+          <w:color w:val="003366"/>
+          <w:sz w:val="28"/>
+        </w:rPr>
+        <w:t>ÍNDICE DE CONTENIDOS</w:t>
+      </w:r>
+    </w:p>
+    <w:p>
+      <w:r>
+        <w:rPr>
+          <w:rFonts w:ascii="Arial" w:hAnsi="Arial"/>
+          <w:b/>
+          <w:sz w:val="19"/>
+        </w:rPr>
+        <w:t>1. Antecedentes Personales</w:t>
+      </w:r>
+      <w:r>
+        <w:rPr>
+          <w:rFonts w:ascii="Arial" w:hAnsi="Arial"/>
+          <w:color w:val="888888"/>
+          <w:sz w:val="18"/>
+        </w:rPr>
+        <w:t xml:space="preserve"> ·································· Pág. 3</w:t>
+      </w:r>
+    </w:p>
+    <w:p>
+      <w:r>
+        <w:rPr>
+          <w:rFonts w:ascii="Arial" w:hAnsi="Arial"/>
+          <w:b/>
+          <w:sz w:val="19"/>
+        </w:rPr>
+        <w:t>2. Descripción Proyecto APT (Áreas de Desempeño y Competencias)</w:t>
+      </w:r>
+      <w:r>
+        <w:rPr>
+          <w:rFonts w:ascii="Arial" w:hAnsi="Arial"/>
+          <w:color w:val="888888"/>
+          <w:sz w:val="18"/>
+        </w:rPr>
+        <w:t xml:space="preserve">  Pág. 3</w:t>
+      </w:r>
+    </w:p>
+    <w:p>
+      <w:r>
+        <w:rPr>
+          <w:rFonts w:ascii="Arial" w:hAnsi="Arial"/>
+          <w:b/>
+          <w:sz w:val="19"/>
+        </w:rPr>
+        <w:t>3. Fundamentación Proyecto APT</w:t>
+      </w:r>
+      <w:r>
+        <w:rPr>
+          <w:rFonts w:ascii="Arial" w:hAnsi="Arial"/>
+          <w:color w:val="888888"/>
+          <w:sz w:val="18"/>
+        </w:rPr>
+        <w:t xml:space="preserve"> ······························ Pág. 4</w:t>
+      </w:r>
+    </w:p>
+    <w:p>
+      <w:r>
+        <w:rPr>
+          <w:rFonts w:ascii="Arial" w:hAnsi="Arial"/>
+          <w:b w:val="0"/>
+          <w:sz w:val="19"/>
+        </w:rPr>
+        <w:t xml:space="preserve">   3.1 Relevancia del Proyecto APT</w:t>
+      </w:r>
+      <w:r>
+        <w:rPr>
+          <w:rFonts w:ascii="Arial" w:hAnsi="Arial"/>
+          <w:color w:val="888888"/>
+          <w:sz w:val="18"/>
+        </w:rPr>
+        <w:t xml:space="preserve"> ·························· Pág. 4</w:t>
+      </w:r>
+    </w:p>
+    <w:p>
+      <w:r>
+        <w:rPr>
+          <w:rFonts w:ascii="Arial" w:hAnsi="Arial"/>
+          <w:b w:val="0"/>
+          <w:sz w:val="19"/>
+        </w:rPr>
+        <w:t xml:space="preserve">   3.2 Descripción del Proyecto APT</w:t>
+      </w:r>
+      <w:r>
+        <w:rPr>
+          <w:rFonts w:ascii="Arial" w:hAnsi="Arial"/>
+          <w:color w:val="888888"/>
+          <w:sz w:val="18"/>
+        </w:rPr>
+        <w:t xml:space="preserve"> ························· Pág. 4</w:t>
+      </w:r>
+    </w:p>
+    <w:p>
+      <w:r>
+        <w:rPr>
+          <w:rFonts w:ascii="Arial" w:hAnsi="Arial"/>
+          <w:b w:val="0"/>
+          <w:sz w:val="19"/>
+        </w:rPr>
+        <w:t xml:space="preserve">   3.3 Pertinencia del Proyecto con el Perfil de Egreso</w:t>
+      </w:r>
+      <w:r>
+        <w:rPr>
+          <w:rFonts w:ascii="Arial" w:hAnsi="Arial"/>
+          <w:color w:val="888888"/>
+          <w:sz w:val="18"/>
+        </w:rPr>
+        <w:t xml:space="preserve"> ····· Pág. 4</w:t>
+      </w:r>
+    </w:p>
+    <w:p>
+      <w:r>
+        <w:rPr>
+          <w:rFonts w:ascii="Arial" w:hAnsi="Arial"/>
+          <w:b w:val="0"/>
+          <w:sz w:val="19"/>
+        </w:rPr>
+        <w:t xml:space="preserve">   3.4 Relación con los Intereses Profesionales</w:t>
+      </w:r>
+      <w:r>
+        <w:rPr>
+          <w:rFonts w:ascii="Arial" w:hAnsi="Arial"/>
+          <w:color w:val="888888"/>
+          <w:sz w:val="18"/>
+        </w:rPr>
+        <w:t xml:space="preserve"> ············· Pág. 4</w:t>
+      </w:r>
+    </w:p>
+    <w:p>
+      <w:r>
+        <w:rPr>
+          <w:rFonts w:ascii="Arial" w:hAnsi="Arial"/>
+          <w:b w:val="0"/>
+          <w:sz w:val="19"/>
+        </w:rPr>
+        <w:t xml:space="preserve">   3.5 Factibilidad de Desarrollo del Proyecto APT</w:t>
+      </w:r>
+      <w:r>
+        <w:rPr>
+          <w:rFonts w:ascii="Arial" w:hAnsi="Arial"/>
+          <w:color w:val="888888"/>
+          <w:sz w:val="18"/>
+        </w:rPr>
+        <w:t xml:space="preserve"> ·········· Pág. 5</w:t>
+      </w:r>
+    </w:p>
+    <w:p>
+      <w:r>
+        <w:rPr>
+          <w:rFonts w:ascii="Arial" w:hAnsi="Arial"/>
+          <w:b/>
+          <w:sz w:val="19"/>
+        </w:rPr>
+        <w:t>4. Objetivos (Objetivo General y Específicos como Acciones)</w:t>
+      </w:r>
+      <w:r>
+        <w:rPr>
+          <w:rFonts w:ascii="Arial" w:hAnsi="Arial"/>
+          <w:color w:val="888888"/>
+          <w:sz w:val="18"/>
+        </w:rPr>
+        <w:t xml:space="preserve"> · Pág. 5</w:t>
+      </w:r>
+    </w:p>
+    <w:p>
+      <w:r>
+        <w:rPr>
+          <w:rFonts w:ascii="Arial" w:hAnsi="Arial"/>
+          <w:b/>
+          <w:sz w:val="19"/>
+        </w:rPr>
+        <w:t>5. Metodología (Ciclo Iterativo y Roles del Equipo)</w:t>
+      </w:r>
+      <w:r>
+        <w:rPr>
+          <w:rFonts w:ascii="Arial" w:hAnsi="Arial"/>
+          <w:color w:val="888888"/>
+          <w:sz w:val="18"/>
+        </w:rPr>
+        <w:t xml:space="preserve"> ········· Pág. 6</w:t>
+      </w:r>
+    </w:p>
+    <w:p>
+      <w:r>
+        <w:rPr>
+          <w:rFonts w:ascii="Arial" w:hAnsi="Arial"/>
+          <w:b/>
+          <w:sz w:val="19"/>
+        </w:rPr>
+        <w:t>6. Tabla Oficial de Evidencias (Avance y Finales)</w:t>
+      </w:r>
+      <w:r>
+        <w:rPr>
+          <w:rFonts w:ascii="Arial" w:hAnsi="Arial"/>
+          <w:color w:val="888888"/>
+          <w:sz w:val="18"/>
+        </w:rPr>
+        <w:t xml:space="preserve"> ··········· Pág. 7</w:t>
+      </w:r>
+    </w:p>
+    <w:p>
+      <w:r>
+        <w:rPr>
+          <w:rFonts w:ascii="Arial" w:hAnsi="Arial"/>
+          <w:b/>
+          <w:sz w:val="19"/>
+        </w:rPr>
+        <w:t>7. Tabla Oficial de Plan de Trabajo (Recursos y Observaciones)</w:t>
+      </w:r>
+      <w:r>
+        <w:rPr>
+          <w:rFonts w:ascii="Arial" w:hAnsi="Arial"/>
+          <w:color w:val="888888"/>
+          <w:sz w:val="18"/>
+        </w:rPr>
+        <w:t xml:space="preserve">  Pág. 8</w:t>
+      </w:r>
+    </w:p>
+    <w:p>
+      <w:r>
+        <w:rPr>
+          <w:rFonts w:ascii="Arial" w:hAnsi="Arial"/>
+          <w:b/>
+          <w:sz w:val="19"/>
+        </w:rPr>
+        <w:t>8. Carta Gantt (18 Semanas Académicas)</w:t>
+      </w:r>
+      <w:r>
+        <w:rPr>
+          <w:rFonts w:ascii="Arial" w:hAnsi="Arial"/>
+          <w:color w:val="888888"/>
+          <w:sz w:val="18"/>
+        </w:rPr>
+        <w:t xml:space="preserve"> ······················ Pág. 9</w:t>
+      </w:r>
+    </w:p>
+    <w:p>
+      <w:r>
+        <w:br w:type="page"/>
+      </w:r>
+    </w:p>
+    <w:p>
+      <w:r>
+        <w:rPr>
+          <w:rFonts w:ascii="Arial" w:hAnsi="Arial"/>
+          <w:b/>
+          <w:color w:val="003366"/>
           <w:sz w:val="24"/>
         </w:rPr>
+        <w:t>A. PARTE I</w:t>
+        <w:br/>
         <w:t>1. Antecedentes Personales</w:t>
       </w:r>
     </w:p>
@@ -294,6 +711,7 @@
         <w:rPr>
           <w:rFonts w:ascii="Arial" w:hAnsi="Arial"/>
           <w:b/>
+          <w:color w:val="003366"/>
           <w:sz w:val="24"/>
         </w:rPr>
         <w:t>2. Descripción Proyecto APT</w:t>
@@ -392,13 +810,13 @@
                 <w:rFonts w:ascii="Arial" w:hAnsi="Arial"/>
                 <w:sz w:val="19"/>
               </w:rPr>
-              <w:t>• Seguridad de la Información, Ciberseguridad Defensiva y Hardening Perimetral.</w:t>
+              <w:t>• Seguridad de Sistemas y Redes: Ciberseguridad Defensiva y Hardening Perimetral.</w:t>
               <w:br/>
-              <w:t>• Infraestructura de Redes Corporativas, Routing y Switching L2/L3 (VLANs 802.1Q).</w:t>
+              <w:t>• Administración de Redes y Telecomunicaciones: Infraestructura L2/L3 (VLANs 802.1Q).</w:t>
               <w:br/>
-              <w:t>• Telecomunicaciones, Telefonía VoIP SIP/PJSIP y Streaming de Audio en Tiempo Real.</w:t>
+              <w:t>• Comunicación Unificada y Corporativa: Telefonía VoIP SIP/PJSIP y Streaming de Voz.</w:t>
               <w:br/>
-              <w:t>• Automatización, Programación en Python e Integración de Inteligencia Artificial (SOAR).</w:t>
+              <w:t>• Análisis de Soluciones de Conectividad: Automatización en Python 3.12 y SOAR con IA.</w:t>
             </w:r>
           </w:p>
         </w:tc>
@@ -442,28 +860,33 @@
                 <w:rFonts w:ascii="Arial" w:hAnsi="Arial"/>
                 <w:sz w:val="19"/>
               </w:rPr>
-              <w:t>• Competencia 3: Adaptar tecnologías de punta y tendencias emergentes de conectividad.</w:t>
+              <w:t>• Competencia 8: Crear planes de prevención y respuesta a riesgos informáticos en la red.</w:t>
+              <w:br/>
+              <w:t>• Competencia 6: Automatizar procesos y gestión de plataformas de red mediante scripting.</w:t>
+              <w:br/>
+              <w:t>• Competencia 5: Unificar servicios de voz, datos y video asegurando calidad de servicio (QoS).</w:t>
               <w:br/>
               <w:t>• Competencia 4: Controlar y operar redes corporativas de gran tamaño.</w:t>
               <w:br/>
-              <w:t>• Competencia 5: Unificar servicios de voz, datos y video.</w:t>
-              <w:br/>
-              <w:t>• Competencia 6: Automatizar procesos y gestión de plataformas de red.</w:t>
+              <w:t>• Competencia 3: Adaptar tecnologías de punta y tendencias tecnológicas emergentes.</w:t>
               <w:br/>
               <w:t>• Competencia 7: Gestionar la seguridad de la información frente a vulnerabilidades.</w:t>
-              <w:br/>
-              <w:t>• Competencia 8: Crear planes de prevención y respuesta a riesgos informáticos.</w:t>
             </w:r>
           </w:p>
         </w:tc>
       </w:tr>
     </w:tbl>
-    <w:p/>
+    <w:p>
+      <w:r>
+        <w:br w:type="page"/>
+      </w:r>
+    </w:p>
     <w:p>
       <w:r>
         <w:rPr>
           <w:rFonts w:ascii="Arial" w:hAnsi="Arial"/>
           <w:b/>
+          <w:color w:val="003366"/>
           <w:sz w:val="24"/>
         </w:rPr>
         <w:t>3. Fundamentación Proyecto APT</w:t>
@@ -496,7 +919,7 @@
               <w:rPr>
                 <w:rFonts w:ascii="Arial" w:hAnsi="Arial"/>
                 <w:b/>
-                <w:sz w:val="19"/>
+                <w:sz w:val="18"/>
               </w:rPr>
               <w:t>Relevancia del proyecto APT</w:t>
             </w:r>
@@ -516,9 +939,15 @@
             <w:r>
               <w:rPr>
                 <w:rFonts w:ascii="Arial" w:hAnsi="Arial"/>
-                <w:sz w:val="19"/>
+                <w:sz w:val="18"/>
               </w:rPr>
-              <w:t>El proyecto resuelve dos fallas críticas en los SOC modernos: la sobrecarga paralizante de más de un 50% de falsos positivos en firewalls y el colapso cognitivo del operador humano bajo presión durante una brecha activa. KRONOS SENTINEL aporta una solución SOAR de Costo Cero ($0 CLP) que desacopla la contención técnica en kernel de FreeBSD (&lt;100 ms) de la comunicación estratégica mediante llamadas con IA conversacional (&lt;1.5 s).</w:t>
+              <w:t>El proyecto resuelve dos fallas críticas en los SOC modernos:</w:t>
+              <w:br/>
+              <w:t>1) La crisis de más de 50% de falsos positivos en firewalls que satura las colas de incidentes.</w:t>
+              <w:br/>
+              <w:t>2) El colapso cognitivo del operador humano bajo ataque grave (visión de túnel entre aislar el firewall por CLI y contactar al CISO).</w:t>
+              <w:br/>
+              <w:t>KRONOS SENTINEL aporta una solución SOAR de Costo Cero ($0 CLP) que desacopla la contención atómica en kernel de FreeBSD (&lt;100 ms) de la comunicación estratégica telefónica mediante Inteligencia Artificial conversacional (&lt;1.5 s).</w:t>
             </w:r>
           </w:p>
         </w:tc>
@@ -540,7 +969,7 @@
               <w:rPr>
                 <w:rFonts w:ascii="Arial" w:hAnsi="Arial"/>
                 <w:b/>
-                <w:sz w:val="19"/>
+                <w:sz w:val="18"/>
               </w:rPr>
               <w:t>Descripción del Proyecto APT</w:t>
             </w:r>
@@ -560,9 +989,17 @@
             <w:r>
               <w:rPr>
                 <w:rFonts w:ascii="Arial" w:hAnsi="Arial"/>
-                <w:sz w:val="19"/>
+                <w:sz w:val="18"/>
               </w:rPr>
-              <w:t>Arquitectura de defensa en profundidad compuesta por: 1) Firewall pfSense CE 2.9.0 con Suricata Inline Netmap IPS y pfBlockerNG GeoIP; 2) DMZ con HAProxy SSL protegiendo el laboratorio vulnerable DVWA; 3) Motor de Correlación KRONOS (Python 3.12) con análisis heurístico AST y control en kernel con pfctl (kill states y tabla snort2c); y 4) Centralita Asterisk 20 LTS con auto-dialer AMI y Google Gemini Live Flash 3.1 para debriefing interactivo por voz.</w:t>
+              <w:t>Arquitectura de defensa en profundidad de 4 módulos:</w:t>
+              <w:br/>
+              <w:t>1) Firewall pfSense CE 2.9.0 con Suricata Inline Netmap IPS y pfBlockerNG GeoIP MaxMind.</w:t>
+              <w:br/>
+              <w:t>2) DMZ con HAProxy 2.8+ SSL Offloading y Stick-Tables anti-fuzzing L7 protegiendo DVWA en Docker.</w:t>
+              <w:br/>
+              <w:t>3) Motor de Correlación KRONOS (Python 3.12) con analizador heurístico AST y control de kernel con pfctl (terminación de estados y tabla snort2c).</w:t>
+              <w:br/>
+              <w:t>4) Centralita Asterisk 20 LTS en Docker con auto-dialer AMI y Google Gemini Live Flash 3.1 para debriefing interactivo por voz.</w:t>
             </w:r>
           </w:p>
         </w:tc>
@@ -584,7 +1021,7 @@
               <w:rPr>
                 <w:rFonts w:ascii="Arial" w:hAnsi="Arial"/>
                 <w:b/>
-                <w:sz w:val="19"/>
+                <w:sz w:val="18"/>
               </w:rPr>
               <w:t>Pertinencia del proyecto con el perfil de egreso</w:t>
             </w:r>
@@ -604,7 +1041,7 @@
             <w:r>
               <w:rPr>
                 <w:rFonts w:ascii="Arial" w:hAnsi="Arial"/>
-                <w:sz w:val="19"/>
+                <w:sz w:val="18"/>
               </w:rPr>
               <w:t>Integra armónicamente las 4 áreas troncales de Ingeniería en Conectividad y Redes: Routing &amp; Switching L2/L3 (VLANs 802.1Q), Ciberseguridad Perimetral (Hardening, IPS, Zero Trust), Telefonía VoIP (Asterisk SIP/PJSIP) y Automatización (Python, IPC, IA Generativa).</w:t>
             </w:r>
@@ -628,7 +1065,7 @@
               <w:rPr>
                 <w:rFonts w:ascii="Arial" w:hAnsi="Arial"/>
                 <w:b/>
-                <w:sz w:val="19"/>
+                <w:sz w:val="18"/>
               </w:rPr>
               <w:t>Relación con los intereses profesionales</w:t>
             </w:r>
@@ -648,9 +1085,9 @@
             <w:r>
               <w:rPr>
                 <w:rFonts w:ascii="Arial" w:hAnsi="Arial"/>
-                <w:sz w:val="19"/>
+                <w:sz w:val="18"/>
               </w:rPr>
-              <w:t>Se alinea con mi especialización como Ingeniero de Ciberseguridad / Arquitecto SecOps y SOAR, consolidando la experiencia práctica liderando el equipo de competiciones CTF DevSec y proyectos de mitigación perimetral.</w:t>
+              <w:t>Se alinea directamente con mi meta profesional de desempeñarme como Ingeniero de Ciberseguridad / Arquitecto SecOps y SOAR, consolidando la experiencia práctica liderando el equipo de competiciones CTF DevSec y proyectos de mitigación perimetral con estándares internacionales (NIST SP 800-207, Cisco CCNA, CompTIA Security+).</w:t>
             </w:r>
           </w:p>
         </w:tc>
@@ -672,7 +1109,7 @@
               <w:rPr>
                 <w:rFonts w:ascii="Arial" w:hAnsi="Arial"/>
                 <w:b/>
-                <w:sz w:val="19"/>
+                <w:sz w:val="18"/>
               </w:rPr>
               <w:t>Factibilidad de desarrollo del Proyecto APT</w:t>
             </w:r>
@@ -692,9 +1129,17 @@
             <w:r>
               <w:rPr>
                 <w:rFonts w:ascii="Arial" w:hAnsi="Arial"/>
-                <w:sz w:val="19"/>
+                <w:sz w:val="18"/>
               </w:rPr>
-              <w:t>Factible al 100%: 1) 18 semanas de planificación semestral; 2) 72h lectivas + 144h autónomas; 3) Materiales con Costo Cero ($0 CLP) basados en software libre y capas comunitarias gratuitas; 4) Infraestructura de virtualización Proxmox/VMware; 5) Superación de restricciones CGNAT mediante túnel Zero Trust Mesh con Tailscale Subnet Router.</w:t>
+              <w:t>Alcance acotado y 100% factible para 18 semanas con 4 integrantes:</w:t>
+              <w:br/>
+              <w:t>• 18 semanas semestrales (72h taller presencial + 144h laboratorio autónomo = 864h de ingeniería grupal).</w:t>
+              <w:br/>
+              <w:t>• Materiales con Costo Cero ($0 CLP) basados en software libre (FreeBSD, pfSense, Suricata, Docker, Asterisk, Python) y capas gratuitas comunitarias (Gemini Live Free Tier, MaxMind GeoLite2).</w:t>
+              <w:br/>
+              <w:t>• Infraestructura de virtualización Proxmox VE / VMware y laboratorios Duoc UC.</w:t>
+              <w:br/>
+              <w:t>• Mitigación de riesgos: CGNAT resuelto mediante malla Zero Trust con Tailscale Subnet Router; falsos positivos controlados con AST; latencia de voz mitigada con streaming WebSocket PCM 24kHz.</w:t>
             </w:r>
           </w:p>
         </w:tc>
@@ -710,6 +1155,7 @@
         <w:rPr>
           <w:rFonts w:ascii="Arial" w:hAnsi="Arial"/>
           <w:b/>
+          <w:color w:val="003366"/>
           <w:sz w:val="24"/>
         </w:rPr>
         <w:t>B. PARTE II</w:t>
@@ -744,7 +1190,7 @@
               <w:rPr>
                 <w:rFonts w:ascii="Arial" w:hAnsi="Arial"/>
                 <w:b/>
-                <w:sz w:val="19"/>
+                <w:sz w:val="18"/>
               </w:rPr>
               <w:t>Objetivo general</w:t>
             </w:r>
@@ -764,7 +1210,7 @@
             <w:r>
               <w:rPr>
                 <w:rFonts w:ascii="Arial" w:hAnsi="Arial"/>
-                <w:sz w:val="19"/>
+                <w:sz w:val="18"/>
               </w:rPr>
               <w:t>Diseñar, implementar y validar una arquitectura de defensa en profundidad y respuesta autónoma ante incidentes (SOAR) de costo cero ($0 CLP) denominada KRONOS SENTINEL, integrando prevención de intrusiones en kernel, supresión heurística de falsos positivos e interlocución telefónica interactiva por voz en tiempo real con Inteligencia Artificial hacia los responsables de seguridad (CISO).</w:t>
             </w:r>
@@ -788,7 +1234,7 @@
               <w:rPr>
                 <w:rFonts w:ascii="Arial" w:hAnsi="Arial"/>
                 <w:b/>
-                <w:sz w:val="19"/>
+                <w:sz w:val="18"/>
               </w:rPr>
               <w:t>Objetivos específicos</w:t>
             </w:r>
@@ -808,23 +1254,27 @@
             <w:r>
               <w:rPr>
                 <w:rFonts w:ascii="Arial" w:hAnsi="Arial"/>
-                <w:sz w:val="19"/>
+                <w:sz w:val="18"/>
               </w:rPr>
-              <w:t>1. Diseñar e implementar la infraestructura perimetral en pfSense CE 2.9.0 con segmentación en 4 VLANs 802.1Q.</w:t>
+              <w:t>1. Diseñar la topología lógica y física de red perimetral segmentada en 4 VLANs 802.1Q en pfSense CE 2.9.0.</w:t>
               <w:br/>
-              <w:t>2. Configurar Suricata 7.x en modo Inline IPS (Netmap) con reglas dropsid.conf para descarte en hardware.</w:t>
+              <w:t>2. Implementar la configuración de pfSense CE 2.9.0 con políticas Zero Trust y optimización de hardware offloading para Netmap.</w:t>
               <w:br/>
-              <w:t>3. Implementar HAProxy 2.8+ SSL con Stick-Tables anti-fuzzing L7 protegiendo el entorno DVWA en DMZ.</w:t>
+              <w:t>3. Configurar el motor de prevención Suricata 7.x en modo Inline IPS (Netmap) con reglas dropsid.conf para descarte en hardware.</w:t>
               <w:br/>
-              <w:t>4. Desarrollar en Python 3.12 el Motor de Correlación KRONOS con análisis sintáctico AST de SQLi/RCE suprimiendo &gt;50% de falsos positivos.</w:t>
+              <w:t>4. Implementar el filtrado geográfico y reputacional con pfBlockerNG-devel utilizando MaxMind GeoLite2 y feeds FireHOL.</w:t>
               <w:br/>
-              <w:t>5. Integrar el control en kernel de FreeBSD con pfctl para terminación de estados (pfctl -k) y verificación de tabla snort2c.</w:t>
+              <w:t>5. Configurar el proxy inverso HAProxy 2.8+ SSL con Stick-Tables anti-fuzzing L7 protegiendo el entorno DVWA en DMZ.</w:t>
               <w:br/>
-              <w:t>6. Desplegar Asterisk 20 LTS en Docker con canal PJSIP y auto-dialer AMI hacia el CISO.</w:t>
+              <w:t>6. Desarrollar en Python 3.12 el Motor de Correlación KRONOS con análisis sintáctico AST suprimiendo &gt;50% de falsos positivos.</w:t>
               <w:br/>
-              <w:t>7. Desarrollar el bridge WebSocket hacia Google Gemini Live Flash 3.1 para debriefing interactivo por voz.</w:t>
+              <w:t>7. Integrar el control en kernel de FreeBSD mediante pfctl para terminación de estados (pfctl -k) y verificación en tabla snort2c.</w:t>
               <w:br/>
-              <w:t>8. Validar la efectividad y rendimiento integral mediante matrices de aseguramiento de calidad (QA).</w:t>
+              <w:t>8. Desplegar la centralita Asterisk 20 LTS en Docker con canal PJSIP y módulo auto-dialer AMI hacia el softphone del CISO.</w:t>
+              <w:br/>
+              <w:t>9. Construir el puente WebSocket hacia Google Gemini Live Flash 3.1 para debriefing hablado bidireccional en tiempo real.</w:t>
+              <w:br/>
+              <w:t>10. Validar el rendimiento, latencia (&lt;1.5 s) y efectividad integral mediante matrices de aseguramiento de calidad (QA).</w:t>
             </w:r>
           </w:p>
         </w:tc>
@@ -836,6 +1286,7 @@
         <w:rPr>
           <w:rFonts w:ascii="Arial" w:hAnsi="Arial"/>
           <w:b/>
+          <w:color w:val="003366"/>
           <w:sz w:val="24"/>
         </w:rPr>
         <w:t>5. Metodología</w:t>
@@ -865,30 +1316,30 @@
             <w:r>
               <w:rPr>
                 <w:rFonts w:ascii="Arial" w:hAnsi="Arial"/>
-                <w:sz w:val="19"/>
+                <w:sz w:val="18"/>
               </w:rPr>
               <w:t>Descripción de la Metodología:</w:t>
               <w:br/>
-              <w:t>Se aplicará una Metodología de Ingeniería en Ciclo Iterativo e Incremental en 4 fases operativas con validación continua QA:</w:t>
+              <w:t>Se aplicará una Metodología de Ingeniería en Ciclo Iterativo e Incremental en 4 fases operativas:</w:t>
               <w:br/>
-              <w:t>• Fase 1: Diseño y Topología de Red (VLANs 802.1Q, direccionamiento IP y hardening pfSense CE 2.9.0).</w:t>
+              <w:t>• Fase 1: Levantamiento, Diseño y Topología de Red (Semanas 1 a 4).</w:t>
               <w:br/>
-              <w:t>• Fase 2: Seguridad Perimetral y DMZ (Suricata Inline Netmap IPS, pfBlockerNG GeoIP, HAProxy SSL y DVWA).</w:t>
+              <w:t>• Fase 2: Implementación de Perímetro y Capa Web DMZ (Semanas 5 a 10).</w:t>
               <w:br/>
-              <w:t>• Fase 3: Motor de Correlación KRONOS y Telefonía IA (Python 3.12 AST parser, pfctl kernel control, Asterisk PBX y Gemini Live API).</w:t>
+              <w:t>• Fase 3: Desarrollo de KRONOS, Telefonía PBX y Voz IA (Semanas 11 a 15).</w:t>
               <w:br/>
-              <w:t>• Fase 4: Integración SOAR, Pruebas QA y Auditoría (Simulaciones SQLi en vivo, medición de latencia &lt;1.5s y documentación técnica).</w:t>
+              <w:t>• Fase 4: Pruebas de Integración SOAR, Auditoría QA y Defensa (Semanas 16 a 18).</w:t>
               <w:br/>
               <w:br/>
-              <w:t>Distribución de Funciones y Tareas del Equipo:</w:t>
+              <w:t>Distribución de Funciones, Tareas y Responsabilidades del Equipo:</w:t>
               <w:br/>
-              <w:t>• Bruno Urrea Ortiz: Líder de Ciberseguridad, desarrollo del Motor de Correlación KRONOS, algoritmo AST anti-ruido, control en kernel pfctl y cliente WebSocket Gemini Live.</w:t>
+              <w:t>• Bruno Urrea Ortiz: Líder de Ciberseguridad, arquitectura global, desarrollo del Motor KRONOS AST, wrappers pfctl en kernel y WebSocket Gemini Live.</w:t>
               <w:br/>
-              <w:t>• Freddy Vásquez Cortés: Ingeniería de Routing, segmentación VLAN 802.1Q, centralita Asterisk 20 LTS en Docker, auto-dialer AMI y enlace Tailscale.</w:t>
+              <w:t>• Freddy Vásquez Cortés: Ingeniería de Routing, segmentación VLAN 802.1Q, centralita Asterisk 20 LTS en Docker, auto-dialer AMI y malla Tailscale.</w:t>
               <w:br/>
-              <w:t>• Cristóbal Quezada: Administración de Servicios Web, configuración HAProxy 2.8+ SSL, Stick-Tables de rate-limiting y laboratorio web DVWA en DMZ.</w:t>
+              <w:t>• Cristóbal Quezada: Administración de Servicios Web, configuración HAProxy 2.8+ SSL, Stick-Tables de rate-limiting y laboratorio DVWA en DMZ.</w:t>
               <w:br/>
-              <w:t>• Kevin Retamales: Hardening de firewall pfSense Zero Trust, pfBlockerNG-devel (MaxMind GeoIP y feeds FireHOL/Spamhaus) y matrices de control de calidad QA.</w:t>
+              <w:t>• Kevin Retamales: Hardening de firewall pfSense Zero Trust, pfBlockerNG-devel GeoIP y matrices de control de calidad QA.</w:t>
             </w:r>
           </w:p>
         </w:tc>
@@ -904,6 +1355,7 @@
         <w:rPr>
           <w:rFonts w:ascii="Arial" w:hAnsi="Arial"/>
           <w:b/>
+          <w:color w:val="003366"/>
           <w:sz w:val="24"/>
         </w:rPr>
         <w:t>6. Evidencias</w:t>
@@ -933,7 +1385,7 @@
                 <w:b/>
                 <w:color w:val="FFFFFF"/>
               </w:rPr>
-              <w:t>Tipo de evidencia</w:t>
+              <w:t>Tipo de evidencia (avance o final)</w:t>
             </w:r>
           </w:p>
         </w:tc>
@@ -1000,7 +1452,7 @@
                 <w:rFonts w:ascii="Arial" w:hAnsi="Arial"/>
                 <w:sz w:val="17"/>
               </w:rPr>
-              <w:t>Avance (F1)</w:t>
+              <w:t>Avance (Fase 1)</w:t>
             </w:r>
           </w:p>
         </w:tc>
@@ -1020,7 +1472,7 @@
                 <w:rFonts w:ascii="Arial" w:hAnsi="Arial"/>
                 <w:sz w:val="17"/>
               </w:rPr>
-              <w:t>Informe de Definición y Topología</w:t>
+              <w:t>Informe de Definición y Topología de Red</w:t>
             </w:r>
           </w:p>
         </w:tc>
@@ -1040,7 +1492,7 @@
                 <w:rFonts w:ascii="Arial" w:hAnsi="Arial"/>
                 <w:sz w:val="17"/>
               </w:rPr>
-              <w:t>Documento técnico formal con diseño L2/L3 y matriz de VLANs.</w:t>
+              <w:t>Documento técnico formal con diseño L2/L3, matriz de direccionamiento IP y fundamentación metodológica.</w:t>
             </w:r>
           </w:p>
         </w:tc>
@@ -1060,7 +1512,7 @@
                 <w:rFonts w:ascii="Arial" w:hAnsi="Arial"/>
                 <w:sz w:val="17"/>
               </w:rPr>
-              <w:t>Valida la correcta planificación de la infraestructura.</w:t>
+              <w:t>Valida la correcta planificación de la infraestructura y el marco teórico.</w:t>
             </w:r>
           </w:p>
         </w:tc>
@@ -1083,7 +1535,7 @@
                 <w:rFonts w:ascii="Arial" w:hAnsi="Arial"/>
                 <w:sz w:val="17"/>
               </w:rPr>
-              <w:t>Avance (F2)</w:t>
+              <w:t>Avance (Fase 2)</w:t>
             </w:r>
           </w:p>
         </w:tc>
@@ -1104,7 +1556,7 @@
                 <w:rFonts w:ascii="Arial" w:hAnsi="Arial"/>
                 <w:sz w:val="17"/>
               </w:rPr>
-              <w:t>Repositorio Git de Código e IaC</w:t>
+              <w:t>Repositorio Git de Código Fuente e IaC</w:t>
             </w:r>
           </w:p>
         </w:tc>
@@ -1125,7 +1577,7 @@
                 <w:rFonts w:ascii="Arial" w:hAnsi="Arial"/>
                 <w:sz w:val="17"/>
               </w:rPr>
-              <w:t>GitHub con código del Motor KRONOS, Dockerfiles y configs pfSense.</w:t>
+              <w:t>Repositorio GitHub con el código del Motor KRONOS, Dockerfiles y configuraciones pfSense.</w:t>
             </w:r>
           </w:p>
         </w:tc>
@@ -1146,7 +1598,7 @@
                 <w:rFonts w:ascii="Arial" w:hAnsi="Arial"/>
                 <w:sz w:val="17"/>
               </w:rPr>
-              <w:t>Demuestra el avance tangible en desarrollo y automatización.</w:t>
+              <w:t>Demuestra el avance tangible en desarrollo, integración de APIs y automatización.</w:t>
             </w:r>
           </w:p>
         </w:tc>
@@ -1168,7 +1620,7 @@
                 <w:rFonts w:ascii="Arial" w:hAnsi="Arial"/>
                 <w:sz w:val="17"/>
               </w:rPr>
-              <w:t>Avance (F2)</w:t>
+              <w:t>Avance (Fase 2)</w:t>
             </w:r>
           </w:p>
         </w:tc>
@@ -1188,7 +1640,7 @@
                 <w:rFonts w:ascii="Arial" w:hAnsi="Arial"/>
                 <w:sz w:val="17"/>
               </w:rPr>
-              <w:t>Manuales Técnicos y Mockups PDF</w:t>
+              <w:t>Manuales Técnicos y Mockups en PDF</w:t>
             </w:r>
           </w:p>
         </w:tc>
@@ -1208,7 +1660,7 @@
                 <w:rFonts w:ascii="Arial" w:hAnsi="Arial"/>
                 <w:sz w:val="17"/>
               </w:rPr>
-              <w:t>Manual pfSense CE 2.9.0 y Tutorial Paso a Paso con WebGUI cards.</w:t>
+              <w:t>Manual de configuración de pfSense CE 2.9.0 y Tutorial Paso a Paso con WebGUI mockups.</w:t>
             </w:r>
           </w:p>
         </w:tc>
@@ -1228,7 +1680,7 @@
                 <w:rFonts w:ascii="Arial" w:hAnsi="Arial"/>
                 <w:sz w:val="17"/>
               </w:rPr>
-              <w:t>Acredita la reproducibilidad y rigor técnico de las configuraciones.</w:t>
+              <w:t>Acredita la reproducibilidad y rigor técnico de los procedimientos perimetrales.</w:t>
             </w:r>
           </w:p>
         </w:tc>
@@ -1251,7 +1703,7 @@
                 <w:rFonts w:ascii="Arial" w:hAnsi="Arial"/>
                 <w:sz w:val="17"/>
               </w:rPr>
-              <w:t>Final (F3)</w:t>
+              <w:t>Final (Fase 3)</w:t>
             </w:r>
           </w:p>
         </w:tc>
@@ -1272,7 +1724,7 @@
                 <w:rFonts w:ascii="Arial" w:hAnsi="Arial"/>
                 <w:sz w:val="17"/>
               </w:rPr>
-              <w:t>Demostración en Vivo SOAR</w:t>
+              <w:t>Demostración en Vivo de Intrusión y SOAR</w:t>
             </w:r>
           </w:p>
         </w:tc>
@@ -1293,7 +1745,7 @@
                 <w:rFonts w:ascii="Arial" w:hAnsi="Arial"/>
                 <w:sz w:val="17"/>
               </w:rPr>
-              <w:t>Inyección SQL en DVWA ➔ Bloqueo kernel snort2c ➔ Llamada Gemini Live.</w:t>
+              <w:t>Inyección SQL en DVWA ➔ Bloqueo en kernel FreeBSD (snort2c) ➔ Llamada por voz Gemini Live.</w:t>
             </w:r>
           </w:p>
         </w:tc>
@@ -1314,7 +1766,7 @@
                 <w:rFonts w:ascii="Arial" w:hAnsi="Arial"/>
                 <w:sz w:val="17"/>
               </w:rPr>
-              <w:t>Evidencia concluyente del cumplimiento del objetivo general.</w:t>
+              <w:t>Evidencia concluyente del funcionamiento operativo y cumplimiento del objetivo general.</w:t>
             </w:r>
           </w:p>
         </w:tc>
@@ -1336,7 +1788,7 @@
                 <w:rFonts w:ascii="Arial" w:hAnsi="Arial"/>
                 <w:sz w:val="17"/>
               </w:rPr>
-              <w:t>Final (F3)</w:t>
+              <w:t>Final (Fase 3)</w:t>
             </w:r>
           </w:p>
         </w:tc>
@@ -1356,7 +1808,7 @@
                 <w:rFonts w:ascii="Arial" w:hAnsi="Arial"/>
                 <w:sz w:val="17"/>
               </w:rPr>
-              <w:t>Matrices QA y Logs Forenses</w:t>
+              <w:t>Matrices de Pruebas QA y Logs Forenses</w:t>
             </w:r>
           </w:p>
         </w:tc>
@@ -1376,7 +1828,7 @@
                 <w:rFonts w:ascii="Arial" w:hAnsi="Arial"/>
                 <w:sz w:val="17"/>
               </w:rPr>
-              <w:t>Registros EVE JSON, salidas pfctl y métricas de latencia (&lt;1.5s).</w:t>
+              <w:t>Registros EVE JSON de Suricata, salidas pfctl y mediciones de latencia (&lt;1.5 s).</w:t>
             </w:r>
           </w:p>
         </w:tc>
@@ -1396,7 +1848,7 @@
                 <w:rFonts w:ascii="Arial" w:hAnsi="Arial"/>
                 <w:sz w:val="17"/>
               </w:rPr>
-              <w:t>Respaldan con datos empíricos la supresión de ruido y robustez.</w:t>
+              <w:t>Respaldan con datos empíricos la supresión de ruido y robustez en kernel.</w:t>
             </w:r>
           </w:p>
         </w:tc>
@@ -1419,7 +1871,7 @@
                 <w:rFonts w:ascii="Arial" w:hAnsi="Arial"/>
                 <w:sz w:val="17"/>
               </w:rPr>
-              <w:t>Final (F3)</w:t>
+              <w:t>Final (Fase 3)</w:t>
             </w:r>
           </w:p>
         </w:tc>
@@ -1440,7 +1892,7 @@
                 <w:rFonts w:ascii="Arial" w:hAnsi="Arial"/>
                 <w:sz w:val="17"/>
               </w:rPr>
-              <w:t>Informe Final y Presentación</w:t>
+              <w:t>Informe Final Consolidado y Presentación</w:t>
             </w:r>
           </w:p>
         </w:tc>
@@ -1461,7 +1913,7 @@
                 <w:rFonts w:ascii="Arial" w:hAnsi="Arial"/>
                 <w:sz w:val="17"/>
               </w:rPr>
-              <w:t>Documento consolidado del proyecto y diapositivas de defensa.</w:t>
+              <w:t>Documento consolidado del proyecto y diapositivas de defensa ejecutiva en formato 16:9.</w:t>
             </w:r>
           </w:p>
         </w:tc>
@@ -1482,18 +1934,23 @@
                 <w:rFonts w:ascii="Arial" w:hAnsi="Arial"/>
                 <w:sz w:val="17"/>
               </w:rPr>
-              <w:t>Entrega formal exigida para la titulación en Portafolio APT122.</w:t>
+              <w:t>Entrega formal académica exigida para la titulación en Portafolio APT122.</w:t>
             </w:r>
           </w:p>
         </w:tc>
       </w:tr>
     </w:tbl>
-    <w:p/>
+    <w:p>
+      <w:r>
+        <w:br w:type="page"/>
+      </w:r>
+    </w:p>
     <w:p>
       <w:r>
         <w:rPr>
           <w:rFonts w:ascii="Arial" w:hAnsi="Arial"/>
           <w:b/>
+          <w:color w:val="003366"/>
           <w:sz w:val="24"/>
         </w:rPr>
         <w:t>7. Plan de Trabajo</w:t>
@@ -1526,7 +1983,7 @@
                 <w:b/>
                 <w:color w:val="FFFFFF"/>
               </w:rPr>
-              <w:t>Competencia</w:t>
+              <w:t>Competencia o unidades</w:t>
             </w:r>
           </w:p>
         </w:tc>
@@ -1541,7 +1998,7 @@
                 <w:b/>
                 <w:color w:val="FFFFFF"/>
               </w:rPr>
-              <w:t>Nombre Actividad</w:t>
+              <w:t>Nombre de Actividades/Tareas</w:t>
             </w:r>
           </w:p>
         </w:tc>
@@ -1556,7 +2013,7 @@
                 <w:b/>
                 <w:color w:val="FFFFFF"/>
               </w:rPr>
-              <w:t>Descripción</w:t>
+              <w:t>Descripción Actividades/Tareas</w:t>
             </w:r>
           </w:p>
         </w:tc>
@@ -1601,7 +2058,7 @@
                 <w:b/>
                 <w:color w:val="FFFFFF"/>
               </w:rPr>
-              <w:t>Responsable</w:t>
+              <w:t>Responsable¹</w:t>
             </w:r>
           </w:p>
         </w:tc>
@@ -1616,7 +2073,7 @@
                 <w:b/>
                 <w:color w:val="FFFFFF"/>
               </w:rPr>
-              <w:t>Observaciones</w:t>
+              <w:t>Observaciones (Facilitadores / Obstáculos)</w:t>
             </w:r>
           </w:p>
         </w:tc>
@@ -1626,17 +2083,17 @@
           <w:tcPr>
             <w:tcW w:type="dxa" w:w="1419"/>
             <w:tcMar>
-              <w:top w:w="50" w:type="dxa"/>
-              <w:bottom w:w="50" w:type="dxa"/>
-              <w:left w:w="60" w:type="dxa"/>
-              <w:right w:w="60" w:type="dxa"/>
+              <w:top w:w="40" w:type="dxa"/>
+              <w:bottom w:w="40" w:type="dxa"/>
+              <w:left w:w="50" w:type="dxa"/>
+              <w:right w:w="50" w:type="dxa"/>
             </w:tcMar>
           </w:tcPr>
           <w:p>
             <w:r>
               <w:rPr>
                 <w:rFonts w:ascii="Arial" w:hAnsi="Arial"/>
-                <w:sz w:val="16"/>
+                <w:sz w:val="15"/>
               </w:rPr>
               <w:t>Comp. 4 &amp; 8</w:t>
             </w:r>
@@ -1646,19 +2103,19 @@
           <w:tcPr>
             <w:tcW w:type="dxa" w:w="1419"/>
             <w:tcMar>
-              <w:top w:w="50" w:type="dxa"/>
-              <w:bottom w:w="50" w:type="dxa"/>
-              <w:left w:w="60" w:type="dxa"/>
-              <w:right w:w="60" w:type="dxa"/>
+              <w:top w:w="40" w:type="dxa"/>
+              <w:bottom w:w="40" w:type="dxa"/>
+              <w:left w:w="50" w:type="dxa"/>
+              <w:right w:w="50" w:type="dxa"/>
             </w:tcMar>
           </w:tcPr>
           <w:p>
             <w:r>
               <w:rPr>
                 <w:rFonts w:ascii="Arial" w:hAnsi="Arial"/>
-                <w:sz w:val="16"/>
+                <w:sz w:val="15"/>
               </w:rPr>
-              <w:t>A1. Setup pfSense</w:t>
+              <w:t>A1. Setup Base pfSense</w:t>
             </w:r>
           </w:p>
         </w:tc>
@@ -1666,19 +2123,19 @@
           <w:tcPr>
             <w:tcW w:type="dxa" w:w="1419"/>
             <w:tcMar>
-              <w:top w:w="50" w:type="dxa"/>
-              <w:bottom w:w="50" w:type="dxa"/>
-              <w:left w:w="60" w:type="dxa"/>
-              <w:right w:w="60" w:type="dxa"/>
+              <w:top w:w="40" w:type="dxa"/>
+              <w:bottom w:w="40" w:type="dxa"/>
+              <w:left w:w="50" w:type="dxa"/>
+              <w:right w:w="50" w:type="dxa"/>
             </w:tcMar>
           </w:tcPr>
           <w:p>
             <w:r>
               <w:rPr>
                 <w:rFonts w:ascii="Arial" w:hAnsi="Arial"/>
-                <w:sz w:val="16"/>
+                <w:sz w:val="15"/>
               </w:rPr>
-              <w:t>Instalación pfSense 2.9.0, WAN/LAN y tuning de hardware offloading.</w:t>
+              <w:t>Instalación pfSense 2.9.0, WAN/LAN y tuning hardware offloading.</w:t>
             </w:r>
           </w:p>
         </w:tc>
@@ -1686,19 +2143,19 @@
           <w:tcPr>
             <w:tcW w:type="dxa" w:w="1419"/>
             <w:tcMar>
-              <w:top w:w="50" w:type="dxa"/>
-              <w:bottom w:w="50" w:type="dxa"/>
-              <w:left w:w="60" w:type="dxa"/>
-              <w:right w:w="60" w:type="dxa"/>
+              <w:top w:w="40" w:type="dxa"/>
+              <w:bottom w:w="40" w:type="dxa"/>
+              <w:left w:w="50" w:type="dxa"/>
+              <w:right w:w="50" w:type="dxa"/>
             </w:tcMar>
           </w:tcPr>
           <w:p>
             <w:r>
               <w:rPr>
                 <w:rFonts w:ascii="Arial" w:hAnsi="Arial"/>
-                <w:sz w:val="16"/>
+                <w:sz w:val="15"/>
               </w:rPr>
-              <w:t>pfSense ISO</w:t>
+              <w:t>pfSense ISO, Proxmox</w:t>
             </w:r>
           </w:p>
         </w:tc>
@@ -1706,17 +2163,17 @@
           <w:tcPr>
             <w:tcW w:type="dxa" w:w="1419"/>
             <w:tcMar>
-              <w:top w:w="50" w:type="dxa"/>
-              <w:bottom w:w="50" w:type="dxa"/>
-              <w:left w:w="60" w:type="dxa"/>
-              <w:right w:w="60" w:type="dxa"/>
+              <w:top w:w="40" w:type="dxa"/>
+              <w:bottom w:w="40" w:type="dxa"/>
+              <w:left w:w="50" w:type="dxa"/>
+              <w:right w:w="50" w:type="dxa"/>
             </w:tcMar>
           </w:tcPr>
           <w:p>
             <w:r>
               <w:rPr>
                 <w:rFonts w:ascii="Arial" w:hAnsi="Arial"/>
-                <w:sz w:val="16"/>
+                <w:sz w:val="15"/>
               </w:rPr>
               <w:t>S1 - S2</w:t>
             </w:r>
@@ -1726,17 +2183,17 @@
           <w:tcPr>
             <w:tcW w:type="dxa" w:w="1419"/>
             <w:tcMar>
-              <w:top w:w="50" w:type="dxa"/>
-              <w:bottom w:w="50" w:type="dxa"/>
-              <w:left w:w="60" w:type="dxa"/>
-              <w:right w:w="60" w:type="dxa"/>
+              <w:top w:w="40" w:type="dxa"/>
+              <w:bottom w:w="40" w:type="dxa"/>
+              <w:left w:w="50" w:type="dxa"/>
+              <w:right w:w="50" w:type="dxa"/>
             </w:tcMar>
           </w:tcPr>
           <w:p>
             <w:r>
               <w:rPr>
                 <w:rFonts w:ascii="Arial" w:hAnsi="Arial"/>
-                <w:sz w:val="16"/>
+                <w:sz w:val="15"/>
               </w:rPr>
               <w:t>Bruno / Freddy</w:t>
             </w:r>
@@ -1746,19 +2203,21 @@
           <w:tcPr>
             <w:tcW w:type="dxa" w:w="1419"/>
             <w:tcMar>
-              <w:top w:w="50" w:type="dxa"/>
-              <w:bottom w:w="50" w:type="dxa"/>
-              <w:left w:w="60" w:type="dxa"/>
-              <w:right w:w="60" w:type="dxa"/>
+              <w:top w:w="40" w:type="dxa"/>
+              <w:bottom w:w="40" w:type="dxa"/>
+              <w:left w:w="50" w:type="dxa"/>
+              <w:right w:w="50" w:type="dxa"/>
             </w:tcMar>
           </w:tcPr>
           <w:p>
             <w:r>
               <w:rPr>
                 <w:rFonts w:ascii="Arial" w:hAnsi="Arial"/>
-                <w:sz w:val="16"/>
+                <w:sz w:val="15"/>
               </w:rPr>
-              <w:t>Desactivar TSO/LRO para Netmap.</w:t>
+              <w:t>Facilitador: Docs Netgate.</w:t>
+              <w:br/>
+              <w:t>Obstáculo: Incompatibilidad TSO/LRO; se desactiva.</w:t>
             </w:r>
           </w:p>
         </w:tc>
@@ -1769,17 +2228,17 @@
             <w:tcW w:type="dxa" w:w="1419"/>
             <w:shd w:fill="F7FAFC"/>
             <w:tcMar>
-              <w:top w:w="50" w:type="dxa"/>
-              <w:bottom w:w="50" w:type="dxa"/>
-              <w:left w:w="60" w:type="dxa"/>
-              <w:right w:w="60" w:type="dxa"/>
+              <w:top w:w="40" w:type="dxa"/>
+              <w:bottom w:w="40" w:type="dxa"/>
+              <w:left w:w="50" w:type="dxa"/>
+              <w:right w:w="50" w:type="dxa"/>
             </w:tcMar>
           </w:tcPr>
           <w:p>
             <w:r>
               <w:rPr>
                 <w:rFonts w:ascii="Arial" w:hAnsi="Arial"/>
-                <w:sz w:val="16"/>
+                <w:sz w:val="15"/>
               </w:rPr>
               <w:t>Comp. 4</w:t>
             </w:r>
@@ -1790,19 +2249,19 @@
             <w:tcW w:type="dxa" w:w="1419"/>
             <w:shd w:fill="F7FAFC"/>
             <w:tcMar>
-              <w:top w:w="50" w:type="dxa"/>
-              <w:bottom w:w="50" w:type="dxa"/>
-              <w:left w:w="60" w:type="dxa"/>
-              <w:right w:w="60" w:type="dxa"/>
+              <w:top w:w="40" w:type="dxa"/>
+              <w:bottom w:w="40" w:type="dxa"/>
+              <w:left w:w="50" w:type="dxa"/>
+              <w:right w:w="50" w:type="dxa"/>
             </w:tcMar>
           </w:tcPr>
           <w:p>
             <w:r>
               <w:rPr>
                 <w:rFonts w:ascii="Arial" w:hAnsi="Arial"/>
-                <w:sz w:val="16"/>
+                <w:sz w:val="15"/>
               </w:rPr>
-              <w:t>A2. VLANs 802.1Q</w:t>
+              <w:t>A2. Segmentación VLANs</w:t>
             </w:r>
           </w:p>
         </w:tc>
@@ -1811,19 +2270,19 @@
             <w:tcW w:type="dxa" w:w="1419"/>
             <w:shd w:fill="F7FAFC"/>
             <w:tcMar>
-              <w:top w:w="50" w:type="dxa"/>
-              <w:bottom w:w="50" w:type="dxa"/>
-              <w:left w:w="60" w:type="dxa"/>
-              <w:right w:w="60" w:type="dxa"/>
+              <w:top w:w="40" w:type="dxa"/>
+              <w:bottom w:w="40" w:type="dxa"/>
+              <w:left w:w="50" w:type="dxa"/>
+              <w:right w:w="50" w:type="dxa"/>
             </w:tcMar>
           </w:tcPr>
           <w:p>
             <w:r>
               <w:rPr>
                 <w:rFonts w:ascii="Arial" w:hAnsi="Arial"/>
-                <w:sz w:val="16"/>
+                <w:sz w:val="15"/>
               </w:rPr>
-              <w:t>Creación de VLANs 10, 20, 30, 99 y servidores DHCP.</w:t>
+              <w:t>Creación de VLANs 10, 20, 30, 99 y servidores DHCP locales.</w:t>
             </w:r>
           </w:p>
         </w:tc>
@@ -1832,19 +2291,19 @@
             <w:tcW w:type="dxa" w:w="1419"/>
             <w:shd w:fill="F7FAFC"/>
             <w:tcMar>
-              <w:top w:w="50" w:type="dxa"/>
-              <w:bottom w:w="50" w:type="dxa"/>
-              <w:left w:w="60" w:type="dxa"/>
-              <w:right w:w="60" w:type="dxa"/>
+              <w:top w:w="40" w:type="dxa"/>
+              <w:bottom w:w="40" w:type="dxa"/>
+              <w:left w:w="50" w:type="dxa"/>
+              <w:right w:w="50" w:type="dxa"/>
             </w:tcMar>
           </w:tcPr>
           <w:p>
             <w:r>
               <w:rPr>
                 <w:rFonts w:ascii="Arial" w:hAnsi="Arial"/>
-                <w:sz w:val="16"/>
+                <w:sz w:val="15"/>
               </w:rPr>
-              <w:t>pfSense WebGUI</w:t>
+              <w:t>pfSense WebGUI, Switch L2</w:t>
             </w:r>
           </w:p>
         </w:tc>
@@ -1853,17 +2312,17 @@
             <w:tcW w:type="dxa" w:w="1419"/>
             <w:shd w:fill="F7FAFC"/>
             <w:tcMar>
-              <w:top w:w="50" w:type="dxa"/>
-              <w:bottom w:w="50" w:type="dxa"/>
-              <w:left w:w="60" w:type="dxa"/>
-              <w:right w:w="60" w:type="dxa"/>
+              <w:top w:w="40" w:type="dxa"/>
+              <w:bottom w:w="40" w:type="dxa"/>
+              <w:left w:w="50" w:type="dxa"/>
+              <w:right w:w="50" w:type="dxa"/>
             </w:tcMar>
           </w:tcPr>
           <w:p>
             <w:r>
               <w:rPr>
                 <w:rFonts w:ascii="Arial" w:hAnsi="Arial"/>
-                <w:sz w:val="16"/>
+                <w:sz w:val="15"/>
               </w:rPr>
               <w:t>S3 - S4</w:t>
             </w:r>
@@ -1874,17 +2333,17 @@
             <w:tcW w:type="dxa" w:w="1419"/>
             <w:shd w:fill="F7FAFC"/>
             <w:tcMar>
-              <w:top w:w="50" w:type="dxa"/>
-              <w:bottom w:w="50" w:type="dxa"/>
-              <w:left w:w="60" w:type="dxa"/>
-              <w:right w:w="60" w:type="dxa"/>
+              <w:top w:w="40" w:type="dxa"/>
+              <w:bottom w:w="40" w:type="dxa"/>
+              <w:left w:w="50" w:type="dxa"/>
+              <w:right w:w="50" w:type="dxa"/>
             </w:tcMar>
           </w:tcPr>
           <w:p>
             <w:r>
               <w:rPr>
                 <w:rFonts w:ascii="Arial" w:hAnsi="Arial"/>
-                <w:sz w:val="16"/>
+                <w:sz w:val="15"/>
               </w:rPr>
               <w:t>Freddy Vásquez</w:t>
             </w:r>
@@ -1895,19 +2354,21 @@
             <w:tcW w:type="dxa" w:w="1419"/>
             <w:shd w:fill="F7FAFC"/>
             <w:tcMar>
-              <w:top w:w="50" w:type="dxa"/>
-              <w:bottom w:w="50" w:type="dxa"/>
-              <w:left w:w="60" w:type="dxa"/>
-              <w:right w:w="60" w:type="dxa"/>
+              <w:top w:w="40" w:type="dxa"/>
+              <w:bottom w:w="40" w:type="dxa"/>
+              <w:left w:w="50" w:type="dxa"/>
+              <w:right w:w="50" w:type="dxa"/>
             </w:tcMar>
           </w:tcPr>
           <w:p>
             <w:r>
               <w:rPr>
                 <w:rFonts w:ascii="Arial" w:hAnsi="Arial"/>
-                <w:sz w:val="16"/>
+                <w:sz w:val="15"/>
               </w:rPr>
-              <w:t>Mapeos MAC estáticos para servers.</w:t>
+              <w:t>Facilitador: Soporte 802.1Q.</w:t>
+              <w:br/>
+              <w:t>Obstáculo: Fugas inter-VLAN; se aíslan con reglas.</w:t>
             </w:r>
           </w:p>
         </w:tc>
@@ -1917,17 +2378,17 @@
           <w:tcPr>
             <w:tcW w:type="dxa" w:w="1419"/>
             <w:tcMar>
-              <w:top w:w="50" w:type="dxa"/>
-              <w:bottom w:w="50" w:type="dxa"/>
-              <w:left w:w="60" w:type="dxa"/>
-              <w:right w:w="60" w:type="dxa"/>
+              <w:top w:w="40" w:type="dxa"/>
+              <w:bottom w:w="40" w:type="dxa"/>
+              <w:left w:w="50" w:type="dxa"/>
+              <w:right w:w="50" w:type="dxa"/>
             </w:tcMar>
           </w:tcPr>
           <w:p>
             <w:r>
               <w:rPr>
                 <w:rFonts w:ascii="Arial" w:hAnsi="Arial"/>
-                <w:sz w:val="16"/>
+                <w:sz w:val="15"/>
               </w:rPr>
               <w:t>Comp. 7 &amp; 8</w:t>
             </w:r>
@@ -1937,19 +2398,19 @@
           <w:tcPr>
             <w:tcW w:type="dxa" w:w="1419"/>
             <w:tcMar>
-              <w:top w:w="50" w:type="dxa"/>
-              <w:bottom w:w="50" w:type="dxa"/>
-              <w:left w:w="60" w:type="dxa"/>
-              <w:right w:w="60" w:type="dxa"/>
+              <w:top w:w="40" w:type="dxa"/>
+              <w:bottom w:w="40" w:type="dxa"/>
+              <w:left w:w="50" w:type="dxa"/>
+              <w:right w:w="50" w:type="dxa"/>
             </w:tcMar>
           </w:tcPr>
           <w:p>
             <w:r>
               <w:rPr>
                 <w:rFonts w:ascii="Arial" w:hAnsi="Arial"/>
-                <w:sz w:val="16"/>
+                <w:sz w:val="15"/>
               </w:rPr>
-              <w:t>A3. Suricata IPS</w:t>
+              <w:t>A3. Suricata Inline IPS</w:t>
             </w:r>
           </w:p>
         </w:tc>
@@ -1957,19 +2418,19 @@
           <w:tcPr>
             <w:tcW w:type="dxa" w:w="1419"/>
             <w:tcMar>
-              <w:top w:w="50" w:type="dxa"/>
-              <w:bottom w:w="50" w:type="dxa"/>
-              <w:left w:w="60" w:type="dxa"/>
-              <w:right w:w="60" w:type="dxa"/>
+              <w:top w:w="40" w:type="dxa"/>
+              <w:bottom w:w="40" w:type="dxa"/>
+              <w:left w:w="50" w:type="dxa"/>
+              <w:right w:w="50" w:type="dxa"/>
             </w:tcMar>
           </w:tcPr>
           <w:p>
             <w:r>
               <w:rPr>
                 <w:rFonts w:ascii="Arial" w:hAnsi="Arial"/>
-                <w:sz w:val="16"/>
+                <w:sz w:val="15"/>
               </w:rPr>
-              <w:t>Suricata 7.x Inline Netmap, ET Open y dropsid.conf.</w:t>
+              <w:t>Suricata 7.x Inline Netmap, reglas ET Open y dropsid.conf.</w:t>
             </w:r>
           </w:p>
         </w:tc>
@@ -1977,19 +2438,19 @@
           <w:tcPr>
             <w:tcW w:type="dxa" w:w="1419"/>
             <w:tcMar>
-              <w:top w:w="50" w:type="dxa"/>
-              <w:bottom w:w="50" w:type="dxa"/>
-              <w:left w:w="60" w:type="dxa"/>
-              <w:right w:w="60" w:type="dxa"/>
+              <w:top w:w="40" w:type="dxa"/>
+              <w:bottom w:w="40" w:type="dxa"/>
+              <w:left w:w="50" w:type="dxa"/>
+              <w:right w:w="50" w:type="dxa"/>
             </w:tcMar>
           </w:tcPr>
           <w:p>
             <w:r>
               <w:rPr>
                 <w:rFonts w:ascii="Arial" w:hAnsi="Arial"/>
-                <w:sz w:val="16"/>
+                <w:sz w:val="15"/>
               </w:rPr>
-              <w:t>Suricata pkg</w:t>
+              <w:t>Suricata pkg, ET Open</w:t>
             </w:r>
           </w:p>
         </w:tc>
@@ -1997,17 +2458,17 @@
           <w:tcPr>
             <w:tcW w:type="dxa" w:w="1419"/>
             <w:tcMar>
-              <w:top w:w="50" w:type="dxa"/>
-              <w:bottom w:w="50" w:type="dxa"/>
-              <w:left w:w="60" w:type="dxa"/>
-              <w:right w:w="60" w:type="dxa"/>
+              <w:top w:w="40" w:type="dxa"/>
+              <w:bottom w:w="40" w:type="dxa"/>
+              <w:left w:w="50" w:type="dxa"/>
+              <w:right w:w="50" w:type="dxa"/>
             </w:tcMar>
           </w:tcPr>
           <w:p>
             <w:r>
               <w:rPr>
                 <w:rFonts w:ascii="Arial" w:hAnsi="Arial"/>
-                <w:sz w:val="16"/>
+                <w:sz w:val="15"/>
               </w:rPr>
               <w:t>S5 - S6</w:t>
             </w:r>
@@ -2017,17 +2478,17 @@
           <w:tcPr>
             <w:tcW w:type="dxa" w:w="1419"/>
             <w:tcMar>
-              <w:top w:w="50" w:type="dxa"/>
-              <w:bottom w:w="50" w:type="dxa"/>
-              <w:left w:w="60" w:type="dxa"/>
-              <w:right w:w="60" w:type="dxa"/>
+              <w:top w:w="40" w:type="dxa"/>
+              <w:bottom w:w="40" w:type="dxa"/>
+              <w:left w:w="50" w:type="dxa"/>
+              <w:right w:w="50" w:type="dxa"/>
             </w:tcMar>
           </w:tcPr>
           <w:p>
             <w:r>
               <w:rPr>
                 <w:rFonts w:ascii="Arial" w:hAnsi="Arial"/>
-                <w:sz w:val="16"/>
+                <w:sz w:val="15"/>
               </w:rPr>
               <w:t>Bruno / Kevin</w:t>
             </w:r>
@@ -2037,19 +2498,21 @@
           <w:tcPr>
             <w:tcW w:type="dxa" w:w="1419"/>
             <w:tcMar>
-              <w:top w:w="50" w:type="dxa"/>
-              <w:bottom w:w="50" w:type="dxa"/>
-              <w:left w:w="60" w:type="dxa"/>
-              <w:right w:w="60" w:type="dxa"/>
+              <w:top w:w="40" w:type="dxa"/>
+              <w:bottom w:w="40" w:type="dxa"/>
+              <w:left w:w="50" w:type="dxa"/>
+              <w:right w:w="50" w:type="dxa"/>
             </w:tcMar>
           </w:tcPr>
           <w:p>
             <w:r>
               <w:rPr>
                 <w:rFonts w:ascii="Arial" w:hAnsi="Arial"/>
-                <w:sz w:val="16"/>
+                <w:sz w:val="15"/>
               </w:rPr>
-              <w:t>Descarte en hardware ring-buffer.</w:t>
+              <w:t>Facilitador: Hardware drop Netmap.</w:t>
+              <w:br/>
+              <w:t>Obstáculo: Falsos positivos; tuning de SIDs.</w:t>
             </w:r>
           </w:p>
         </w:tc>
@@ -2060,17 +2523,17 @@
             <w:tcW w:type="dxa" w:w="1419"/>
             <w:shd w:fill="F7FAFC"/>
             <w:tcMar>
-              <w:top w:w="50" w:type="dxa"/>
-              <w:bottom w:w="50" w:type="dxa"/>
-              <w:left w:w="60" w:type="dxa"/>
-              <w:right w:w="60" w:type="dxa"/>
+              <w:top w:w="40" w:type="dxa"/>
+              <w:bottom w:w="40" w:type="dxa"/>
+              <w:left w:w="50" w:type="dxa"/>
+              <w:right w:w="50" w:type="dxa"/>
             </w:tcMar>
           </w:tcPr>
           <w:p>
             <w:r>
               <w:rPr>
                 <w:rFonts w:ascii="Arial" w:hAnsi="Arial"/>
-                <w:sz w:val="16"/>
+                <w:sz w:val="15"/>
               </w:rPr>
               <w:t>Comp. 7 &amp; 8</w:t>
             </w:r>
@@ -2081,19 +2544,19 @@
             <w:tcW w:type="dxa" w:w="1419"/>
             <w:shd w:fill="F7FAFC"/>
             <w:tcMar>
-              <w:top w:w="50" w:type="dxa"/>
-              <w:bottom w:w="50" w:type="dxa"/>
-              <w:left w:w="60" w:type="dxa"/>
-              <w:right w:w="60" w:type="dxa"/>
+              <w:top w:w="40" w:type="dxa"/>
+              <w:bottom w:w="40" w:type="dxa"/>
+              <w:left w:w="50" w:type="dxa"/>
+              <w:right w:w="50" w:type="dxa"/>
             </w:tcMar>
           </w:tcPr>
           <w:p>
             <w:r>
               <w:rPr>
                 <w:rFonts w:ascii="Arial" w:hAnsi="Arial"/>
-                <w:sz w:val="16"/>
+                <w:sz w:val="15"/>
               </w:rPr>
-              <w:t>A4. GeoIP pfBlocker</w:t>
+              <w:t>A4. GeoIP pfBlockerNG</w:t>
             </w:r>
           </w:p>
         </w:tc>
@@ -2102,17 +2565,17 @@
             <w:tcW w:type="dxa" w:w="1419"/>
             <w:shd w:fill="F7FAFC"/>
             <w:tcMar>
-              <w:top w:w="50" w:type="dxa"/>
-              <w:bottom w:w="50" w:type="dxa"/>
-              <w:left w:w="60" w:type="dxa"/>
-              <w:right w:w="60" w:type="dxa"/>
+              <w:top w:w="40" w:type="dxa"/>
+              <w:bottom w:w="40" w:type="dxa"/>
+              <w:left w:w="50" w:type="dxa"/>
+              <w:right w:w="50" w:type="dxa"/>
             </w:tcMar>
           </w:tcPr>
           <w:p>
             <w:r>
               <w:rPr>
                 <w:rFonts w:ascii="Arial" w:hAnsi="Arial"/>
-                <w:sz w:val="16"/>
+                <w:sz w:val="15"/>
               </w:rPr>
               <w:t>MaxMind Free, Top Spammers y feeds FireHOL L1/Spamhaus.</w:t>
             </w:r>
@@ -2123,19 +2586,19 @@
             <w:tcW w:type="dxa" w:w="1419"/>
             <w:shd w:fill="F7FAFC"/>
             <w:tcMar>
-              <w:top w:w="50" w:type="dxa"/>
-              <w:bottom w:w="50" w:type="dxa"/>
-              <w:left w:w="60" w:type="dxa"/>
-              <w:right w:w="60" w:type="dxa"/>
+              <w:top w:w="40" w:type="dxa"/>
+              <w:bottom w:w="40" w:type="dxa"/>
+              <w:left w:w="50" w:type="dxa"/>
+              <w:right w:w="50" w:type="dxa"/>
             </w:tcMar>
           </w:tcPr>
           <w:p>
             <w:r>
               <w:rPr>
                 <w:rFonts w:ascii="Arial" w:hAnsi="Arial"/>
-                <w:sz w:val="16"/>
+                <w:sz w:val="15"/>
               </w:rPr>
-              <w:t>pfBlockerNG</w:t>
+              <w:t>pfBlockerNG, MaxMind</w:t>
             </w:r>
           </w:p>
         </w:tc>
@@ -2144,17 +2607,17 @@
             <w:tcW w:type="dxa" w:w="1419"/>
             <w:shd w:fill="F7FAFC"/>
             <w:tcMar>
-              <w:top w:w="50" w:type="dxa"/>
-              <w:bottom w:w="50" w:type="dxa"/>
-              <w:left w:w="60" w:type="dxa"/>
-              <w:right w:w="60" w:type="dxa"/>
+              <w:top w:w="40" w:type="dxa"/>
+              <w:bottom w:w="40" w:type="dxa"/>
+              <w:left w:w="50" w:type="dxa"/>
+              <w:right w:w="50" w:type="dxa"/>
             </w:tcMar>
           </w:tcPr>
           <w:p>
             <w:r>
               <w:rPr>
                 <w:rFonts w:ascii="Arial" w:hAnsi="Arial"/>
-                <w:sz w:val="16"/>
+                <w:sz w:val="15"/>
               </w:rPr>
               <w:t>S7 - S8</w:t>
             </w:r>
@@ -2165,17 +2628,17 @@
             <w:tcW w:type="dxa" w:w="1419"/>
             <w:shd w:fill="F7FAFC"/>
             <w:tcMar>
-              <w:top w:w="50" w:type="dxa"/>
-              <w:bottom w:w="50" w:type="dxa"/>
-              <w:left w:w="60" w:type="dxa"/>
-              <w:right w:w="60" w:type="dxa"/>
+              <w:top w:w="40" w:type="dxa"/>
+              <w:bottom w:w="40" w:type="dxa"/>
+              <w:left w:w="50" w:type="dxa"/>
+              <w:right w:w="50" w:type="dxa"/>
             </w:tcMar>
           </w:tcPr>
           <w:p>
             <w:r>
               <w:rPr>
                 <w:rFonts w:ascii="Arial" w:hAnsi="Arial"/>
-                <w:sz w:val="16"/>
+                <w:sz w:val="15"/>
               </w:rPr>
               <w:t>Kevin Retamales</w:t>
             </w:r>
@@ -2186,19 +2649,21 @@
             <w:tcW w:type="dxa" w:w="1419"/>
             <w:shd w:fill="F7FAFC"/>
             <w:tcMar>
-              <w:top w:w="50" w:type="dxa"/>
-              <w:bottom w:w="50" w:type="dxa"/>
-              <w:left w:w="60" w:type="dxa"/>
-              <w:right w:w="60" w:type="dxa"/>
+              <w:top w:w="40" w:type="dxa"/>
+              <w:bottom w:w="40" w:type="dxa"/>
+              <w:left w:w="50" w:type="dxa"/>
+              <w:right w:w="50" w:type="dxa"/>
             </w:tcMar>
           </w:tcPr>
           <w:p>
             <w:r>
               <w:rPr>
                 <w:rFonts w:ascii="Arial" w:hAnsi="Arial"/>
-                <w:sz w:val="16"/>
+                <w:sz w:val="15"/>
               </w:rPr>
-              <w:t>Reglas flotantes prioritarias.</w:t>
+              <w:t>Facilitador: Feeds globales.</w:t>
+              <w:br/>
+              <w:t>Obstáculo: Memoria RAM; se optimiza límite tablas.</w:t>
             </w:r>
           </w:p>
         </w:tc>
@@ -2208,17 +2673,17 @@
           <w:tcPr>
             <w:tcW w:type="dxa" w:w="1419"/>
             <w:tcMar>
-              <w:top w:w="50" w:type="dxa"/>
-              <w:bottom w:w="50" w:type="dxa"/>
-              <w:left w:w="60" w:type="dxa"/>
-              <w:right w:w="60" w:type="dxa"/>
+              <w:top w:w="40" w:type="dxa"/>
+              <w:bottom w:w="40" w:type="dxa"/>
+              <w:left w:w="50" w:type="dxa"/>
+              <w:right w:w="50" w:type="dxa"/>
             </w:tcMar>
           </w:tcPr>
           <w:p>
             <w:r>
               <w:rPr>
                 <w:rFonts w:ascii="Arial" w:hAnsi="Arial"/>
-                <w:sz w:val="16"/>
+                <w:sz w:val="15"/>
               </w:rPr>
               <w:t>Comp. 7</w:t>
             </w:r>
@@ -2228,19 +2693,19 @@
           <w:tcPr>
             <w:tcW w:type="dxa" w:w="1419"/>
             <w:tcMar>
-              <w:top w:w="50" w:type="dxa"/>
-              <w:bottom w:w="50" w:type="dxa"/>
-              <w:left w:w="60" w:type="dxa"/>
-              <w:right w:w="60" w:type="dxa"/>
+              <w:top w:w="40" w:type="dxa"/>
+              <w:bottom w:w="40" w:type="dxa"/>
+              <w:left w:w="50" w:type="dxa"/>
+              <w:right w:w="50" w:type="dxa"/>
             </w:tcMar>
           </w:tcPr>
           <w:p>
             <w:r>
               <w:rPr>
                 <w:rFonts w:ascii="Arial" w:hAnsi="Arial"/>
-                <w:sz w:val="16"/>
+                <w:sz w:val="15"/>
               </w:rPr>
-              <w:t>A5. HAProxy &amp; DVWA</w:t>
+              <w:t>A5. HAProxy SSL &amp; DVWA</w:t>
             </w:r>
           </w:p>
         </w:tc>
@@ -2248,17 +2713,17 @@
           <w:tcPr>
             <w:tcW w:type="dxa" w:w="1419"/>
             <w:tcMar>
-              <w:top w:w="50" w:type="dxa"/>
-              <w:bottom w:w="50" w:type="dxa"/>
-              <w:left w:w="60" w:type="dxa"/>
-              <w:right w:w="60" w:type="dxa"/>
+              <w:top w:w="40" w:type="dxa"/>
+              <w:bottom w:w="40" w:type="dxa"/>
+              <w:left w:w="50" w:type="dxa"/>
+              <w:right w:w="50" w:type="dxa"/>
             </w:tcMar>
           </w:tcPr>
           <w:p>
             <w:r>
               <w:rPr>
                 <w:rFonts w:ascii="Arial" w:hAnsi="Arial"/>
-                <w:sz w:val="16"/>
+                <w:sz w:val="15"/>
               </w:rPr>
               <w:t>HAProxy SSL 443, Stick-Tables anti-fuzzing y DVWA Docker.</w:t>
             </w:r>
@@ -2268,19 +2733,19 @@
           <w:tcPr>
             <w:tcW w:type="dxa" w:w="1419"/>
             <w:tcMar>
-              <w:top w:w="50" w:type="dxa"/>
-              <w:bottom w:w="50" w:type="dxa"/>
-              <w:left w:w="60" w:type="dxa"/>
-              <w:right w:w="60" w:type="dxa"/>
+              <w:top w:w="40" w:type="dxa"/>
+              <w:bottom w:w="40" w:type="dxa"/>
+              <w:left w:w="50" w:type="dxa"/>
+              <w:right w:w="50" w:type="dxa"/>
             </w:tcMar>
           </w:tcPr>
           <w:p>
             <w:r>
               <w:rPr>
                 <w:rFonts w:ascii="Arial" w:hAnsi="Arial"/>
-                <w:sz w:val="16"/>
+                <w:sz w:val="15"/>
               </w:rPr>
-              <w:t>HAProxy, Docker</w:t>
+              <w:t>HAProxy, Docker, DVWA</w:t>
             </w:r>
           </w:p>
         </w:tc>
@@ -2288,17 +2753,17 @@
           <w:tcPr>
             <w:tcW w:type="dxa" w:w="1419"/>
             <w:tcMar>
-              <w:top w:w="50" w:type="dxa"/>
-              <w:bottom w:w="50" w:type="dxa"/>
-              <w:left w:w="60" w:type="dxa"/>
-              <w:right w:w="60" w:type="dxa"/>
+              <w:top w:w="40" w:type="dxa"/>
+              <w:bottom w:w="40" w:type="dxa"/>
+              <w:left w:w="50" w:type="dxa"/>
+              <w:right w:w="50" w:type="dxa"/>
             </w:tcMar>
           </w:tcPr>
           <w:p>
             <w:r>
               <w:rPr>
                 <w:rFonts w:ascii="Arial" w:hAnsi="Arial"/>
-                <w:sz w:val="16"/>
+                <w:sz w:val="15"/>
               </w:rPr>
               <w:t>S9 - S10</w:t>
             </w:r>
@@ -2308,17 +2773,17 @@
           <w:tcPr>
             <w:tcW w:type="dxa" w:w="1419"/>
             <w:tcMar>
-              <w:top w:w="50" w:type="dxa"/>
-              <w:bottom w:w="50" w:type="dxa"/>
-              <w:left w:w="60" w:type="dxa"/>
-              <w:right w:w="60" w:type="dxa"/>
+              <w:top w:w="40" w:type="dxa"/>
+              <w:bottom w:w="40" w:type="dxa"/>
+              <w:left w:w="50" w:type="dxa"/>
+              <w:right w:w="50" w:type="dxa"/>
             </w:tcMar>
           </w:tcPr>
           <w:p>
             <w:r>
               <w:rPr>
                 <w:rFonts w:ascii="Arial" w:hAnsi="Arial"/>
-                <w:sz w:val="16"/>
+                <w:sz w:val="15"/>
               </w:rPr>
               <w:t>Cristóbal Q.</w:t>
             </w:r>
@@ -2328,19 +2793,21 @@
           <w:tcPr>
             <w:tcW w:type="dxa" w:w="1419"/>
             <w:tcMar>
-              <w:top w:w="50" w:type="dxa"/>
-              <w:bottom w:w="50" w:type="dxa"/>
-              <w:left w:w="60" w:type="dxa"/>
-              <w:right w:w="60" w:type="dxa"/>
+              <w:top w:w="40" w:type="dxa"/>
+              <w:bottom w:w="40" w:type="dxa"/>
+              <w:left w:w="50" w:type="dxa"/>
+              <w:right w:w="50" w:type="dxa"/>
             </w:tcMar>
           </w:tcPr>
           <w:p>
             <w:r>
               <w:rPr>
                 <w:rFonts w:ascii="Arial" w:hAnsi="Arial"/>
-                <w:sz w:val="16"/>
+                <w:sz w:val="15"/>
               </w:rPr>
-              <w:t>Aislamiento DMZ en VLAN 20.</w:t>
+              <w:t>Facilitador: Tablas en RAM.</w:t>
+              <w:br/>
+              <w:t>Obstáculo: Certificados SSL; se emite CA interna.</w:t>
             </w:r>
           </w:p>
         </w:tc>
@@ -2351,17 +2818,17 @@
             <w:tcW w:type="dxa" w:w="1419"/>
             <w:shd w:fill="F7FAFC"/>
             <w:tcMar>
-              <w:top w:w="50" w:type="dxa"/>
-              <w:bottom w:w="50" w:type="dxa"/>
-              <w:left w:w="60" w:type="dxa"/>
-              <w:right w:w="60" w:type="dxa"/>
+              <w:top w:w="40" w:type="dxa"/>
+              <w:bottom w:w="40" w:type="dxa"/>
+              <w:left w:w="50" w:type="dxa"/>
+              <w:right w:w="50" w:type="dxa"/>
             </w:tcMar>
           </w:tcPr>
           <w:p>
             <w:r>
               <w:rPr>
                 <w:rFonts w:ascii="Arial" w:hAnsi="Arial"/>
-                <w:sz w:val="16"/>
+                <w:sz w:val="15"/>
               </w:rPr>
               <w:t>Comp. 6 &amp; 8</w:t>
             </w:r>
@@ -2372,19 +2839,19 @@
             <w:tcW w:type="dxa" w:w="1419"/>
             <w:shd w:fill="F7FAFC"/>
             <w:tcMar>
-              <w:top w:w="50" w:type="dxa"/>
-              <w:bottom w:w="50" w:type="dxa"/>
-              <w:left w:w="60" w:type="dxa"/>
-              <w:right w:w="60" w:type="dxa"/>
+              <w:top w:w="40" w:type="dxa"/>
+              <w:bottom w:w="40" w:type="dxa"/>
+              <w:left w:w="50" w:type="dxa"/>
+              <w:right w:w="50" w:type="dxa"/>
             </w:tcMar>
           </w:tcPr>
           <w:p>
             <w:r>
               <w:rPr>
                 <w:rFonts w:ascii="Arial" w:hAnsi="Arial"/>
-                <w:sz w:val="16"/>
+                <w:sz w:val="15"/>
               </w:rPr>
-              <w:t>A6. Motor KRONOS</w:t>
+              <w:t>A6. Motor KRONOS AST</w:t>
             </w:r>
           </w:p>
         </w:tc>
@@ -2393,17 +2860,17 @@
             <w:tcW w:type="dxa" w:w="1419"/>
             <w:shd w:fill="F7FAFC"/>
             <w:tcMar>
-              <w:top w:w="50" w:type="dxa"/>
-              <w:bottom w:w="50" w:type="dxa"/>
-              <w:left w:w="60" w:type="dxa"/>
-              <w:right w:w="60" w:type="dxa"/>
+              <w:top w:w="40" w:type="dxa"/>
+              <w:bottom w:w="40" w:type="dxa"/>
+              <w:left w:w="50" w:type="dxa"/>
+              <w:right w:w="50" w:type="dxa"/>
             </w:tcMar>
           </w:tcPr>
           <w:p>
             <w:r>
               <w:rPr>
                 <w:rFonts w:ascii="Arial" w:hAnsi="Arial"/>
-                <w:sz w:val="16"/>
+                <w:sz w:val="15"/>
               </w:rPr>
               <w:t>Python 3.12 AST parser, eve.json ingesta y wrapper pfctl.</w:t>
             </w:r>
@@ -2414,19 +2881,19 @@
             <w:tcW w:type="dxa" w:w="1419"/>
             <w:shd w:fill="F7FAFC"/>
             <w:tcMar>
-              <w:top w:w="50" w:type="dxa"/>
-              <w:bottom w:w="50" w:type="dxa"/>
-              <w:left w:w="60" w:type="dxa"/>
-              <w:right w:w="60" w:type="dxa"/>
+              <w:top w:w="40" w:type="dxa"/>
+              <w:bottom w:w="40" w:type="dxa"/>
+              <w:left w:w="50" w:type="dxa"/>
+              <w:right w:w="50" w:type="dxa"/>
             </w:tcMar>
           </w:tcPr>
           <w:p>
             <w:r>
               <w:rPr>
                 <w:rFonts w:ascii="Arial" w:hAnsi="Arial"/>
-                <w:sz w:val="16"/>
+                <w:sz w:val="15"/>
               </w:rPr>
-              <w:t>Python 3.12</w:t>
+              <w:t>Python 3.12, FreeBSD CLI</w:t>
             </w:r>
           </w:p>
         </w:tc>
@@ -2435,17 +2902,17 @@
             <w:tcW w:type="dxa" w:w="1419"/>
             <w:shd w:fill="F7FAFC"/>
             <w:tcMar>
-              <w:top w:w="50" w:type="dxa"/>
-              <w:bottom w:w="50" w:type="dxa"/>
-              <w:left w:w="60" w:type="dxa"/>
-              <w:right w:w="60" w:type="dxa"/>
+              <w:top w:w="40" w:type="dxa"/>
+              <w:bottom w:w="40" w:type="dxa"/>
+              <w:left w:w="50" w:type="dxa"/>
+              <w:right w:w="50" w:type="dxa"/>
             </w:tcMar>
           </w:tcPr>
           <w:p>
             <w:r>
               <w:rPr>
                 <w:rFonts w:ascii="Arial" w:hAnsi="Arial"/>
-                <w:sz w:val="16"/>
+                <w:sz w:val="15"/>
               </w:rPr>
               <w:t>S11 - S12</w:t>
             </w:r>
@@ -2456,17 +2923,17 @@
             <w:tcW w:type="dxa" w:w="1419"/>
             <w:shd w:fill="F7FAFC"/>
             <w:tcMar>
-              <w:top w:w="50" w:type="dxa"/>
-              <w:bottom w:w="50" w:type="dxa"/>
-              <w:left w:w="60" w:type="dxa"/>
-              <w:right w:w="60" w:type="dxa"/>
+              <w:top w:w="40" w:type="dxa"/>
+              <w:bottom w:w="40" w:type="dxa"/>
+              <w:left w:w="50" w:type="dxa"/>
+              <w:right w:w="50" w:type="dxa"/>
             </w:tcMar>
           </w:tcPr>
           <w:p>
             <w:r>
               <w:rPr>
                 <w:rFonts w:ascii="Arial" w:hAnsi="Arial"/>
-                <w:sz w:val="16"/>
+                <w:sz w:val="15"/>
               </w:rPr>
               <w:t>Bruno Urrea</w:t>
             </w:r>
@@ -2477,19 +2944,21 @@
             <w:tcW w:type="dxa" w:w="1419"/>
             <w:shd w:fill="F7FAFC"/>
             <w:tcMar>
-              <w:top w:w="50" w:type="dxa"/>
-              <w:bottom w:w="50" w:type="dxa"/>
-              <w:left w:w="60" w:type="dxa"/>
-              <w:right w:w="60" w:type="dxa"/>
+              <w:top w:w="40" w:type="dxa"/>
+              <w:bottom w:w="40" w:type="dxa"/>
+              <w:left w:w="50" w:type="dxa"/>
+              <w:right w:w="50" w:type="dxa"/>
             </w:tcMar>
           </w:tcPr>
           <w:p>
             <w:r>
               <w:rPr>
                 <w:rFonts w:ascii="Arial" w:hAnsi="Arial"/>
-                <w:sz w:val="16"/>
+                <w:sz w:val="15"/>
               </w:rPr>
-              <w:t>Suprime &gt;50% ruido y kill states.</w:t>
+              <w:t>Facilitador: AST de Python.</w:t>
+              <w:br/>
+              <w:t>Obstáculo: Privilegios; se ajusta sudoers pfctl.</w:t>
             </w:r>
           </w:p>
         </w:tc>
@@ -2499,17 +2968,17 @@
           <w:tcPr>
             <w:tcW w:type="dxa" w:w="1419"/>
             <w:tcMar>
-              <w:top w:w="50" w:type="dxa"/>
-              <w:bottom w:w="50" w:type="dxa"/>
-              <w:left w:w="60" w:type="dxa"/>
-              <w:right w:w="60" w:type="dxa"/>
+              <w:top w:w="40" w:type="dxa"/>
+              <w:bottom w:w="40" w:type="dxa"/>
+              <w:left w:w="50" w:type="dxa"/>
+              <w:right w:w="50" w:type="dxa"/>
             </w:tcMar>
           </w:tcPr>
           <w:p>
             <w:r>
               <w:rPr>
                 <w:rFonts w:ascii="Arial" w:hAnsi="Arial"/>
-                <w:sz w:val="16"/>
+                <w:sz w:val="15"/>
               </w:rPr>
               <w:t>Comp. 5</w:t>
             </w:r>
@@ -2519,19 +2988,19 @@
           <w:tcPr>
             <w:tcW w:type="dxa" w:w="1419"/>
             <w:tcMar>
-              <w:top w:w="50" w:type="dxa"/>
-              <w:bottom w:w="50" w:type="dxa"/>
-              <w:left w:w="60" w:type="dxa"/>
-              <w:right w:w="60" w:type="dxa"/>
+              <w:top w:w="40" w:type="dxa"/>
+              <w:bottom w:w="40" w:type="dxa"/>
+              <w:left w:w="50" w:type="dxa"/>
+              <w:right w:w="50" w:type="dxa"/>
             </w:tcMar>
           </w:tcPr>
           <w:p>
             <w:r>
               <w:rPr>
                 <w:rFonts w:ascii="Arial" w:hAnsi="Arial"/>
-                <w:sz w:val="16"/>
+                <w:sz w:val="15"/>
               </w:rPr>
-              <w:t>A7. Asterisk PBX</w:t>
+              <w:t>A7. Asterisk PBX &amp; AMI</w:t>
             </w:r>
           </w:p>
         </w:tc>
@@ -2539,17 +3008,17 @@
           <w:tcPr>
             <w:tcW w:type="dxa" w:w="1419"/>
             <w:tcMar>
-              <w:top w:w="50" w:type="dxa"/>
-              <w:bottom w:w="50" w:type="dxa"/>
-              <w:left w:w="60" w:type="dxa"/>
-              <w:right w:w="60" w:type="dxa"/>
+              <w:top w:w="40" w:type="dxa"/>
+              <w:bottom w:w="40" w:type="dxa"/>
+              <w:left w:w="50" w:type="dxa"/>
+              <w:right w:w="50" w:type="dxa"/>
             </w:tcMar>
           </w:tcPr>
           <w:p>
             <w:r>
               <w:rPr>
                 <w:rFonts w:ascii="Arial" w:hAnsi="Arial"/>
-                <w:sz w:val="16"/>
+                <w:sz w:val="15"/>
               </w:rPr>
               <w:t>Docker Asterisk 20 LTS, pjsip.conf y auto-dialer AMI.</w:t>
             </w:r>
@@ -2559,19 +3028,19 @@
           <w:tcPr>
             <w:tcW w:type="dxa" w:w="1419"/>
             <w:tcMar>
-              <w:top w:w="50" w:type="dxa"/>
-              <w:bottom w:w="50" w:type="dxa"/>
-              <w:left w:w="60" w:type="dxa"/>
-              <w:right w:w="60" w:type="dxa"/>
+              <w:top w:w="40" w:type="dxa"/>
+              <w:bottom w:w="40" w:type="dxa"/>
+              <w:left w:w="50" w:type="dxa"/>
+              <w:right w:w="50" w:type="dxa"/>
             </w:tcMar>
           </w:tcPr>
           <w:p>
             <w:r>
               <w:rPr>
                 <w:rFonts w:ascii="Arial" w:hAnsi="Arial"/>
-                <w:sz w:val="16"/>
+                <w:sz w:val="15"/>
               </w:rPr>
-              <w:t>Asterisk 20</w:t>
+              <w:t>Docker, Asterisk 20 LTS</w:t>
             </w:r>
           </w:p>
         </w:tc>
@@ -2579,17 +3048,17 @@
           <w:tcPr>
             <w:tcW w:type="dxa" w:w="1419"/>
             <w:tcMar>
-              <w:top w:w="50" w:type="dxa"/>
-              <w:bottom w:w="50" w:type="dxa"/>
-              <w:left w:w="60" w:type="dxa"/>
-              <w:right w:w="60" w:type="dxa"/>
+              <w:top w:w="40" w:type="dxa"/>
+              <w:bottom w:w="40" w:type="dxa"/>
+              <w:left w:w="50" w:type="dxa"/>
+              <w:right w:w="50" w:type="dxa"/>
             </w:tcMar>
           </w:tcPr>
           <w:p>
             <w:r>
               <w:rPr>
                 <w:rFonts w:ascii="Arial" w:hAnsi="Arial"/>
-                <w:sz w:val="16"/>
+                <w:sz w:val="15"/>
               </w:rPr>
               <w:t>S13 - S14</w:t>
             </w:r>
@@ -2599,17 +3068,17 @@
           <w:tcPr>
             <w:tcW w:type="dxa" w:w="1419"/>
             <w:tcMar>
-              <w:top w:w="50" w:type="dxa"/>
-              <w:bottom w:w="50" w:type="dxa"/>
-              <w:left w:w="60" w:type="dxa"/>
-              <w:right w:w="60" w:type="dxa"/>
+              <w:top w:w="40" w:type="dxa"/>
+              <w:bottom w:w="40" w:type="dxa"/>
+              <w:left w:w="50" w:type="dxa"/>
+              <w:right w:w="50" w:type="dxa"/>
             </w:tcMar>
           </w:tcPr>
           <w:p>
             <w:r>
               <w:rPr>
                 <w:rFonts w:ascii="Arial" w:hAnsi="Arial"/>
-                <w:sz w:val="16"/>
+                <w:sz w:val="15"/>
               </w:rPr>
               <w:t>Freddy Vásquez</w:t>
             </w:r>
@@ -2619,19 +3088,21 @@
           <w:tcPr>
             <w:tcW w:type="dxa" w:w="1419"/>
             <w:tcMar>
-              <w:top w:w="50" w:type="dxa"/>
-              <w:bottom w:w="50" w:type="dxa"/>
-              <w:left w:w="60" w:type="dxa"/>
-              <w:right w:w="60" w:type="dxa"/>
+              <w:top w:w="40" w:type="dxa"/>
+              <w:bottom w:w="40" w:type="dxa"/>
+              <w:left w:w="50" w:type="dxa"/>
+              <w:right w:w="50" w:type="dxa"/>
             </w:tcMar>
           </w:tcPr>
           <w:p>
             <w:r>
               <w:rPr>
                 <w:rFonts w:ascii="Arial" w:hAnsi="Arial"/>
-                <w:sz w:val="16"/>
+                <w:sz w:val="15"/>
               </w:rPr>
-              <w:t>Timbrado a softphone PJSIP/1001.</w:t>
+              <w:t>Facilitador: PJSIP moderno.</w:t>
+              <w:br/>
+              <w:t>Obstáculo: NAT traversal; se fija external_media_address.</w:t>
             </w:r>
           </w:p>
         </w:tc>
@@ -2642,17 +3113,17 @@
             <w:tcW w:type="dxa" w:w="1419"/>
             <w:shd w:fill="F7FAFC"/>
             <w:tcMar>
-              <w:top w:w="50" w:type="dxa"/>
-              <w:bottom w:w="50" w:type="dxa"/>
-              <w:left w:w="60" w:type="dxa"/>
-              <w:right w:w="60" w:type="dxa"/>
+              <w:top w:w="40" w:type="dxa"/>
+              <w:bottom w:w="40" w:type="dxa"/>
+              <w:left w:w="50" w:type="dxa"/>
+              <w:right w:w="50" w:type="dxa"/>
             </w:tcMar>
           </w:tcPr>
           <w:p>
             <w:r>
               <w:rPr>
                 <w:rFonts w:ascii="Arial" w:hAnsi="Arial"/>
-                <w:sz w:val="16"/>
+                <w:sz w:val="15"/>
               </w:rPr>
               <w:t>Comp. 3 &amp; 5</w:t>
             </w:r>
@@ -2663,19 +3134,19 @@
             <w:tcW w:type="dxa" w:w="1419"/>
             <w:shd w:fill="F7FAFC"/>
             <w:tcMar>
-              <w:top w:w="50" w:type="dxa"/>
-              <w:bottom w:w="50" w:type="dxa"/>
-              <w:left w:w="60" w:type="dxa"/>
-              <w:right w:w="60" w:type="dxa"/>
+              <w:top w:w="40" w:type="dxa"/>
+              <w:bottom w:w="40" w:type="dxa"/>
+              <w:left w:w="50" w:type="dxa"/>
+              <w:right w:w="50" w:type="dxa"/>
             </w:tcMar>
           </w:tcPr>
           <w:p>
             <w:r>
               <w:rPr>
                 <w:rFonts w:ascii="Arial" w:hAnsi="Arial"/>
-                <w:sz w:val="16"/>
+                <w:sz w:val="15"/>
               </w:rPr>
-              <w:t>A8. Gemini Live</w:t>
+              <w:t>A8. Gemini Live Voice</w:t>
             </w:r>
           </w:p>
         </w:tc>
@@ -2684,19 +3155,19 @@
             <w:tcW w:type="dxa" w:w="1419"/>
             <w:shd w:fill="F7FAFC"/>
             <w:tcMar>
-              <w:top w:w="50" w:type="dxa"/>
-              <w:bottom w:w="50" w:type="dxa"/>
-              <w:left w:w="60" w:type="dxa"/>
-              <w:right w:w="60" w:type="dxa"/>
+              <w:top w:w="40" w:type="dxa"/>
+              <w:bottom w:w="40" w:type="dxa"/>
+              <w:left w:w="50" w:type="dxa"/>
+              <w:right w:w="50" w:type="dxa"/>
             </w:tcMar>
           </w:tcPr>
           <w:p>
             <w:r>
               <w:rPr>
                 <w:rFonts w:ascii="Arial" w:hAnsi="Arial"/>
-                <w:sz w:val="16"/>
+                <w:sz w:val="15"/>
               </w:rPr>
-              <w:t>WebSocket seguro, System Prompts y audio bridge.</w:t>
+              <w:t>WebSocket seguro, System Prompts y audio bridge PCM 24kHz.</w:t>
             </w:r>
           </w:p>
         </w:tc>
@@ -2705,19 +3176,19 @@
             <w:tcW w:type="dxa" w:w="1419"/>
             <w:shd w:fill="F7FAFC"/>
             <w:tcMar>
-              <w:top w:w="50" w:type="dxa"/>
-              <w:bottom w:w="50" w:type="dxa"/>
-              <w:left w:w="60" w:type="dxa"/>
-              <w:right w:w="60" w:type="dxa"/>
+              <w:top w:w="40" w:type="dxa"/>
+              <w:bottom w:w="40" w:type="dxa"/>
+              <w:left w:w="50" w:type="dxa"/>
+              <w:right w:w="50" w:type="dxa"/>
             </w:tcMar>
           </w:tcPr>
           <w:p>
             <w:r>
               <w:rPr>
                 <w:rFonts w:ascii="Arial" w:hAnsi="Arial"/>
-                <w:sz w:val="16"/>
+                <w:sz w:val="15"/>
               </w:rPr>
-              <w:t>Gemini Live API</w:t>
+              <w:t>Gemini Live API, Python</w:t>
             </w:r>
           </w:p>
         </w:tc>
@@ -2726,17 +3197,17 @@
             <w:tcW w:type="dxa" w:w="1419"/>
             <w:shd w:fill="F7FAFC"/>
             <w:tcMar>
-              <w:top w:w="50" w:type="dxa"/>
-              <w:bottom w:w="50" w:type="dxa"/>
-              <w:left w:w="60" w:type="dxa"/>
-              <w:right w:w="60" w:type="dxa"/>
+              <w:top w:w="40" w:type="dxa"/>
+              <w:bottom w:w="40" w:type="dxa"/>
+              <w:left w:w="50" w:type="dxa"/>
+              <w:right w:w="50" w:type="dxa"/>
             </w:tcMar>
           </w:tcPr>
           <w:p>
             <w:r>
               <w:rPr>
                 <w:rFonts w:ascii="Arial" w:hAnsi="Arial"/>
-                <w:sz w:val="16"/>
+                <w:sz w:val="15"/>
               </w:rPr>
               <w:t>S14 - S15</w:t>
             </w:r>
@@ -2747,17 +3218,17 @@
             <w:tcW w:type="dxa" w:w="1419"/>
             <w:shd w:fill="F7FAFC"/>
             <w:tcMar>
-              <w:top w:w="50" w:type="dxa"/>
-              <w:bottom w:w="50" w:type="dxa"/>
-              <w:left w:w="60" w:type="dxa"/>
-              <w:right w:w="60" w:type="dxa"/>
+              <w:top w:w="40" w:type="dxa"/>
+              <w:bottom w:w="40" w:type="dxa"/>
+              <w:left w:w="50" w:type="dxa"/>
+              <w:right w:w="50" w:type="dxa"/>
             </w:tcMar>
           </w:tcPr>
           <w:p>
             <w:r>
               <w:rPr>
                 <w:rFonts w:ascii="Arial" w:hAnsi="Arial"/>
-                <w:sz w:val="16"/>
+                <w:sz w:val="15"/>
               </w:rPr>
               <w:t>Bruno Urrea</w:t>
             </w:r>
@@ -2768,19 +3239,21 @@
             <w:tcW w:type="dxa" w:w="1419"/>
             <w:shd w:fill="F7FAFC"/>
             <w:tcMar>
-              <w:top w:w="50" w:type="dxa"/>
-              <w:bottom w:w="50" w:type="dxa"/>
-              <w:left w:w="60" w:type="dxa"/>
-              <w:right w:w="60" w:type="dxa"/>
+              <w:top w:w="40" w:type="dxa"/>
+              <w:bottom w:w="40" w:type="dxa"/>
+              <w:left w:w="50" w:type="dxa"/>
+              <w:right w:w="50" w:type="dxa"/>
             </w:tcMar>
           </w:tcPr>
           <w:p>
             <w:r>
               <w:rPr>
                 <w:rFonts w:ascii="Arial" w:hAnsi="Arial"/>
-                <w:sz w:val="16"/>
+                <w:sz w:val="15"/>
               </w:rPr>
-              <w:t>Debriefing hablado interactivo.</w:t>
+              <w:t>Facilitador: Free tier baja latencia.</w:t>
+              <w:br/>
+              <w:t>Obstáculo: Sincronía; códec PCM lineal.</w:t>
             </w:r>
           </w:p>
         </w:tc>
@@ -2790,17 +3263,17 @@
           <w:tcPr>
             <w:tcW w:type="dxa" w:w="1419"/>
             <w:tcMar>
-              <w:top w:w="50" w:type="dxa"/>
-              <w:bottom w:w="50" w:type="dxa"/>
-              <w:left w:w="60" w:type="dxa"/>
-              <w:right w:w="60" w:type="dxa"/>
+              <w:top w:w="40" w:type="dxa"/>
+              <w:bottom w:w="40" w:type="dxa"/>
+              <w:left w:w="50" w:type="dxa"/>
+              <w:right w:w="50" w:type="dxa"/>
             </w:tcMar>
           </w:tcPr>
           <w:p>
             <w:r>
               <w:rPr>
                 <w:rFonts w:ascii="Arial" w:hAnsi="Arial"/>
-                <w:sz w:val="16"/>
+                <w:sz w:val="15"/>
               </w:rPr>
               <w:t>Comp. 3 &amp; 4</w:t>
             </w:r>
@@ -2810,17 +3283,17 @@
           <w:tcPr>
             <w:tcW w:type="dxa" w:w="1419"/>
             <w:tcMar>
-              <w:top w:w="50" w:type="dxa"/>
-              <w:bottom w:w="50" w:type="dxa"/>
-              <w:left w:w="60" w:type="dxa"/>
-              <w:right w:w="60" w:type="dxa"/>
+              <w:top w:w="40" w:type="dxa"/>
+              <w:bottom w:w="40" w:type="dxa"/>
+              <w:left w:w="50" w:type="dxa"/>
+              <w:right w:w="50" w:type="dxa"/>
             </w:tcMar>
           </w:tcPr>
           <w:p>
             <w:r>
               <w:rPr>
                 <w:rFonts w:ascii="Arial" w:hAnsi="Arial"/>
-                <w:sz w:val="16"/>
+                <w:sz w:val="15"/>
               </w:rPr>
               <w:t>A9. Malla Tailscale</w:t>
             </w:r>
@@ -2830,17 +3303,17 @@
           <w:tcPr>
             <w:tcW w:type="dxa" w:w="1419"/>
             <w:tcMar>
-              <w:top w:w="50" w:type="dxa"/>
-              <w:bottom w:w="50" w:type="dxa"/>
-              <w:left w:w="60" w:type="dxa"/>
-              <w:right w:w="60" w:type="dxa"/>
+              <w:top w:w="40" w:type="dxa"/>
+              <w:bottom w:w="40" w:type="dxa"/>
+              <w:left w:w="50" w:type="dxa"/>
+              <w:right w:w="50" w:type="dxa"/>
             </w:tcMar>
           </w:tcPr>
           <w:p>
             <w:r>
               <w:rPr>
                 <w:rFonts w:ascii="Arial" w:hAnsi="Arial"/>
-                <w:sz w:val="16"/>
+                <w:sz w:val="15"/>
               </w:rPr>
               <w:t>Publicación subred 192.168.30.0/24 en Tailscale Mesh.</w:t>
             </w:r>
@@ -2850,19 +3323,19 @@
           <w:tcPr>
             <w:tcW w:type="dxa" w:w="1419"/>
             <w:tcMar>
-              <w:top w:w="50" w:type="dxa"/>
-              <w:bottom w:w="50" w:type="dxa"/>
-              <w:left w:w="60" w:type="dxa"/>
-              <w:right w:w="60" w:type="dxa"/>
+              <w:top w:w="40" w:type="dxa"/>
+              <w:bottom w:w="40" w:type="dxa"/>
+              <w:left w:w="50" w:type="dxa"/>
+              <w:right w:w="50" w:type="dxa"/>
             </w:tcMar>
           </w:tcPr>
           <w:p>
             <w:r>
               <w:rPr>
                 <w:rFonts w:ascii="Arial" w:hAnsi="Arial"/>
-                <w:sz w:val="16"/>
+                <w:sz w:val="15"/>
               </w:rPr>
-              <w:t>Tailscale pkg</w:t>
+              <w:t>Tailscale pkg, WireGuard</w:t>
             </w:r>
           </w:p>
         </w:tc>
@@ -2870,17 +3343,17 @@
           <w:tcPr>
             <w:tcW w:type="dxa" w:w="1419"/>
             <w:tcMar>
-              <w:top w:w="50" w:type="dxa"/>
-              <w:bottom w:w="50" w:type="dxa"/>
-              <w:left w:w="60" w:type="dxa"/>
-              <w:right w:w="60" w:type="dxa"/>
+              <w:top w:w="40" w:type="dxa"/>
+              <w:bottom w:w="40" w:type="dxa"/>
+              <w:left w:w="50" w:type="dxa"/>
+              <w:right w:w="50" w:type="dxa"/>
             </w:tcMar>
           </w:tcPr>
           <w:p>
             <w:r>
               <w:rPr>
                 <w:rFonts w:ascii="Arial" w:hAnsi="Arial"/>
-                <w:sz w:val="16"/>
+                <w:sz w:val="15"/>
               </w:rPr>
               <w:t>S15</w:t>
             </w:r>
@@ -2890,17 +3363,17 @@
           <w:tcPr>
             <w:tcW w:type="dxa" w:w="1419"/>
             <w:tcMar>
-              <w:top w:w="50" w:type="dxa"/>
-              <w:bottom w:w="50" w:type="dxa"/>
-              <w:left w:w="60" w:type="dxa"/>
-              <w:right w:w="60" w:type="dxa"/>
+              <w:top w:w="40" w:type="dxa"/>
+              <w:bottom w:w="40" w:type="dxa"/>
+              <w:left w:w="50" w:type="dxa"/>
+              <w:right w:w="50" w:type="dxa"/>
             </w:tcMar>
           </w:tcPr>
           <w:p>
             <w:r>
               <w:rPr>
                 <w:rFonts w:ascii="Arial" w:hAnsi="Arial"/>
-                <w:sz w:val="16"/>
+                <w:sz w:val="15"/>
               </w:rPr>
               <w:t>Freddy Vásquez</w:t>
             </w:r>
@@ -2910,19 +3383,21 @@
           <w:tcPr>
             <w:tcW w:type="dxa" w:w="1419"/>
             <w:tcMar>
-              <w:top w:w="50" w:type="dxa"/>
-              <w:bottom w:w="50" w:type="dxa"/>
-              <w:left w:w="60" w:type="dxa"/>
-              <w:right w:w="60" w:type="dxa"/>
+              <w:top w:w="40" w:type="dxa"/>
+              <w:bottom w:w="40" w:type="dxa"/>
+              <w:left w:w="50" w:type="dxa"/>
+              <w:right w:w="50" w:type="dxa"/>
             </w:tcMar>
           </w:tcPr>
           <w:p>
             <w:r>
               <w:rPr>
                 <w:rFonts w:ascii="Arial" w:hAnsi="Arial"/>
-                <w:sz w:val="16"/>
+                <w:sz w:val="15"/>
               </w:rPr>
-              <w:t>Evade restricciones de CGNAT.</w:t>
+              <w:t>Facilitador: WireGuard evade CGNAT.</w:t>
+              <w:br/>
+              <w:t>Obstáculo: Rutas; aprobación manual panel.</w:t>
             </w:r>
           </w:p>
         </w:tc>
@@ -2933,19 +3408,19 @@
             <w:tcW w:type="dxa" w:w="1419"/>
             <w:shd w:fill="F7FAFC"/>
             <w:tcMar>
-              <w:top w:w="50" w:type="dxa"/>
-              <w:bottom w:w="50" w:type="dxa"/>
-              <w:left w:w="60" w:type="dxa"/>
-              <w:right w:w="60" w:type="dxa"/>
+              <w:top w:w="40" w:type="dxa"/>
+              <w:bottom w:w="40" w:type="dxa"/>
+              <w:left w:w="50" w:type="dxa"/>
+              <w:right w:w="50" w:type="dxa"/>
             </w:tcMar>
           </w:tcPr>
           <w:p>
             <w:r>
               <w:rPr>
                 <w:rFonts w:ascii="Arial" w:hAnsi="Arial"/>
-                <w:sz w:val="16"/>
+                <w:sz w:val="15"/>
               </w:rPr>
-              <w:t>Comp. 7, 8, 11</w:t>
+              <w:t>Comp. 7, 8 &amp; 11</w:t>
             </w:r>
           </w:p>
         </w:tc>
@@ -2954,19 +3429,19 @@
             <w:tcW w:type="dxa" w:w="1419"/>
             <w:shd w:fill="F7FAFC"/>
             <w:tcMar>
-              <w:top w:w="50" w:type="dxa"/>
-              <w:bottom w:w="50" w:type="dxa"/>
-              <w:left w:w="60" w:type="dxa"/>
-              <w:right w:w="60" w:type="dxa"/>
+              <w:top w:w="40" w:type="dxa"/>
+              <w:bottom w:w="40" w:type="dxa"/>
+              <w:left w:w="50" w:type="dxa"/>
+              <w:right w:w="50" w:type="dxa"/>
             </w:tcMar>
           </w:tcPr>
           <w:p>
             <w:r>
               <w:rPr>
                 <w:rFonts w:ascii="Arial" w:hAnsi="Arial"/>
-                <w:sz w:val="16"/>
+                <w:sz w:val="15"/>
               </w:rPr>
-              <w:t>A10. QA &amp; Defensa</w:t>
+              <w:t>A10. Pruebas QA &amp; Defensa</w:t>
             </w:r>
           </w:p>
         </w:tc>
@@ -2975,19 +3450,19 @@
             <w:tcW w:type="dxa" w:w="1419"/>
             <w:shd w:fill="F7FAFC"/>
             <w:tcMar>
-              <w:top w:w="50" w:type="dxa"/>
-              <w:bottom w:w="50" w:type="dxa"/>
-              <w:left w:w="60" w:type="dxa"/>
-              <w:right w:w="60" w:type="dxa"/>
+              <w:top w:w="40" w:type="dxa"/>
+              <w:bottom w:w="40" w:type="dxa"/>
+              <w:left w:w="50" w:type="dxa"/>
+              <w:right w:w="50" w:type="dxa"/>
             </w:tcMar>
           </w:tcPr>
           <w:p>
             <w:r>
               <w:rPr>
                 <w:rFonts w:ascii="Arial" w:hAnsi="Arial"/>
-                <w:sz w:val="16"/>
+                <w:sz w:val="15"/>
               </w:rPr>
-              <w:t>Pruebas de estrés, manuales PDF y preparación defensa.</w:t>
+              <w:t>Pruebas SQLi en vivo, manuales PDF y preparación defensa.</w:t>
             </w:r>
           </w:p>
         </w:tc>
@@ -2996,19 +3471,19 @@
             <w:tcW w:type="dxa" w:w="1419"/>
             <w:shd w:fill="F7FAFC"/>
             <w:tcMar>
-              <w:top w:w="50" w:type="dxa"/>
-              <w:bottom w:w="50" w:type="dxa"/>
-              <w:left w:w="60" w:type="dxa"/>
-              <w:right w:w="60" w:type="dxa"/>
+              <w:top w:w="40" w:type="dxa"/>
+              <w:bottom w:w="40" w:type="dxa"/>
+              <w:left w:w="50" w:type="dxa"/>
+              <w:right w:w="50" w:type="dxa"/>
             </w:tcMar>
           </w:tcPr>
           <w:p>
             <w:r>
               <w:rPr>
                 <w:rFonts w:ascii="Arial" w:hAnsi="Arial"/>
-                <w:sz w:val="16"/>
+                <w:sz w:val="15"/>
               </w:rPr>
-              <w:t>ReportLab, Git</w:t>
+              <w:t>ReportLab, softphone, Git</w:t>
             </w:r>
           </w:p>
         </w:tc>
@@ -3017,17 +3492,17 @@
             <w:tcW w:type="dxa" w:w="1419"/>
             <w:shd w:fill="F7FAFC"/>
             <w:tcMar>
-              <w:top w:w="50" w:type="dxa"/>
-              <w:bottom w:w="50" w:type="dxa"/>
-              <w:left w:w="60" w:type="dxa"/>
-              <w:right w:w="60" w:type="dxa"/>
+              <w:top w:w="40" w:type="dxa"/>
+              <w:bottom w:w="40" w:type="dxa"/>
+              <w:left w:w="50" w:type="dxa"/>
+              <w:right w:w="50" w:type="dxa"/>
             </w:tcMar>
           </w:tcPr>
           <w:p>
             <w:r>
               <w:rPr>
                 <w:rFonts w:ascii="Arial" w:hAnsi="Arial"/>
-                <w:sz w:val="16"/>
+                <w:sz w:val="15"/>
               </w:rPr>
               <w:t>S16 - S18</w:t>
             </w:r>
@@ -3038,17 +3513,17 @@
             <w:tcW w:type="dxa" w:w="1419"/>
             <w:shd w:fill="F7FAFC"/>
             <w:tcMar>
-              <w:top w:w="50" w:type="dxa"/>
-              <w:bottom w:w="50" w:type="dxa"/>
-              <w:left w:w="60" w:type="dxa"/>
-              <w:right w:w="60" w:type="dxa"/>
+              <w:top w:w="40" w:type="dxa"/>
+              <w:bottom w:w="40" w:type="dxa"/>
+              <w:left w:w="50" w:type="dxa"/>
+              <w:right w:w="50" w:type="dxa"/>
             </w:tcMar>
           </w:tcPr>
           <w:p>
             <w:r>
               <w:rPr>
                 <w:rFonts w:ascii="Arial" w:hAnsi="Arial"/>
-                <w:sz w:val="16"/>
+                <w:sz w:val="15"/>
               </w:rPr>
               <w:t>Todo el Equipo</w:t>
             </w:r>
@@ -3059,24 +3534,36 @@
             <w:tcW w:type="dxa" w:w="1419"/>
             <w:shd w:fill="F7FAFC"/>
             <w:tcMar>
-              <w:top w:w="50" w:type="dxa"/>
-              <w:bottom w:w="50" w:type="dxa"/>
-              <w:left w:w="60" w:type="dxa"/>
-              <w:right w:w="60" w:type="dxa"/>
+              <w:top w:w="40" w:type="dxa"/>
+              <w:bottom w:w="40" w:type="dxa"/>
+              <w:left w:w="50" w:type="dxa"/>
+              <w:right w:w="50" w:type="dxa"/>
             </w:tcMar>
           </w:tcPr>
           <w:p>
             <w:r>
               <w:rPr>
                 <w:rFonts w:ascii="Arial" w:hAnsi="Arial"/>
-                <w:sz w:val="16"/>
+                <w:sz w:val="15"/>
               </w:rPr>
-              <w:t>Demostración en vivo aprobada.</w:t>
+              <w:t>Facilitador: Roles definidos.</w:t>
+              <w:br/>
+              <w:t>Obstáculo: Contingencias; scripts de respaldo.</w:t>
             </w:r>
           </w:p>
         </w:tc>
       </w:tr>
     </w:tbl>
+    <w:p>
+      <w:r>
+        <w:rPr>
+          <w:rFonts w:ascii="Arial" w:hAnsi="Arial"/>
+          <w:i/>
+          <w:sz w:val="16"/>
+        </w:rPr>
+        <w:t>¹ En caso de que el Proyecto APT sea grupal, en esta columna se indica el nombre de los responsables de cada tarea para diferenciar la evaluación.</w:t>
+      </w:r>
+    </w:p>
     <w:p>
       <w:r>
         <w:br w:type="page"/>
@@ -3087,6 +3574,7 @@
         <w:rPr>
           <w:rFonts w:ascii="Arial" w:hAnsi="Arial"/>
           <w:b/>
+          <w:color w:val="003366"/>
           <w:sz w:val="24"/>
         </w:rPr>
         <w:t>8. Carta Gantt (18 Semanas Académicas)</w:t>
@@ -3441,7 +3929,7 @@
                 <w:b/>
                 <w:sz w:val="15"/>
               </w:rPr>
-              <w:t>A1. Setup pfSense Base</w:t>
+              <w:t>A1. Setup Base pfSense</w:t>
             </w:r>
           </w:p>
         </w:tc>
@@ -4921,7 +5409,7 @@
                 <w:b/>
                 <w:sz w:val="15"/>
               </w:rPr>
-              <w:t>A6. Motor KRONOS pfctl</w:t>
+              <w:t>A6. Motor KRONOS AST</w:t>
             </w:r>
           </w:p>
         </w:tc>

</xml_diff>